<commit_message>
Update Implementation Report Document
Added Project Structure section
</commit_message>
<xml_diff>
--- a/IPOS-PU/Documentation/Implementation Report (1).docx
+++ b/IPOS-PU/Documentation/Implementation Report (1).docx
@@ -474,7 +474,7 @@
           <w:rFonts w:asciiTheme="majorBidi" w:hAnsiTheme="majorBidi"/>
         </w:rPr>
       </w:pPr>
-      <w:bookmarkStart w:id="0" w:name="_Toc226910850"/>
+      <w:bookmarkStart w:id="0" w:name="_Toc227940235"/>
       <w:r>
         <w:rPr>
           <w:rFonts w:asciiTheme="majorBidi" w:hAnsiTheme="majorBidi"/>
@@ -631,7 +631,7 @@
               <w:tab w:val="right" w:leader="dot" w:pos="9628"/>
             </w:tabs>
             <w:rPr>
-              <w:rFonts w:asciiTheme="majorBidi" w:hAnsiTheme="majorBidi" w:cstheme="majorBidi"/>
+              <w:rFonts w:cstheme="minorBidi"/>
               <w:b w:val="0"/>
               <w:bCs w:val="0"/>
               <w:i w:val="0"/>
@@ -665,10 +665,9 @@
             </w:rPr>
             <w:fldChar w:fldCharType="separate"/>
           </w:r>
-          <w:hyperlink w:anchor="_Toc226910850" w:history="1">
-            <w:r>
-              <w:rPr>
-                <w:rFonts w:asciiTheme="majorBidi" w:hAnsiTheme="majorBidi" w:cstheme="majorBidi"/>
+          <w:hyperlink w:anchor="_Toc227940235" w:history="1">
+            <w:r>
+              <w:rPr>
                 <w:noProof/>
                 <w:webHidden/>
               </w:rPr>
@@ -676,7 +675,6 @@
             </w:r>
             <w:r>
               <w:rPr>
-                <w:rFonts w:asciiTheme="majorBidi" w:hAnsiTheme="majorBidi" w:cstheme="majorBidi"/>
                 <w:noProof/>
                 <w:webHidden/>
               </w:rPr>
@@ -684,22 +682,19 @@
             </w:r>
             <w:r>
               <w:rPr>
-                <w:rFonts w:asciiTheme="majorBidi" w:hAnsiTheme="majorBidi" w:cstheme="majorBidi"/>
-                <w:noProof/>
-                <w:webHidden/>
-              </w:rPr>
-              <w:instrText xml:space="preserve"> PAGEREF _Toc226910850 \h </w:instrText>
-            </w:r>
-            <w:r>
-              <w:rPr>
-                <w:rFonts w:asciiTheme="majorBidi" w:hAnsiTheme="majorBidi" w:cstheme="majorBidi"/>
-                <w:noProof/>
-                <w:webHidden/>
-              </w:rPr>
-            </w:r>
-            <w:r>
-              <w:rPr>
-                <w:rFonts w:asciiTheme="majorBidi" w:hAnsiTheme="majorBidi" w:cstheme="majorBidi"/>
+                <w:noProof/>
+                <w:webHidden/>
+              </w:rPr>
+              <w:instrText xml:space="preserve"> PAGEREF _Toc227940235 \h </w:instrText>
+            </w:r>
+            <w:r>
+              <w:rPr>
+                <w:noProof/>
+                <w:webHidden/>
+              </w:rPr>
+            </w:r>
+            <w:r>
+              <w:rPr>
                 <w:noProof/>
                 <w:webHidden/>
               </w:rPr>
@@ -707,7 +702,6 @@
             </w:r>
             <w:r>
               <w:rPr>
-                <w:rFonts w:asciiTheme="majorBidi" w:hAnsiTheme="majorBidi" w:cstheme="majorBidi"/>
                 <w:noProof/>
                 <w:webHidden/>
               </w:rPr>
@@ -715,7 +709,6 @@
             </w:r>
             <w:r>
               <w:rPr>
-                <w:rFonts w:asciiTheme="majorBidi" w:hAnsiTheme="majorBidi" w:cstheme="majorBidi"/>
                 <w:noProof/>
                 <w:webHidden/>
               </w:rPr>
@@ -727,11 +720,11 @@
           <w:pPr>
             <w:pStyle w:val="TOC1"/>
             <w:tabs>
-              <w:tab w:val="left" w:pos="480"/>
+              <w:tab w:val="left" w:pos="440"/>
               <w:tab w:val="right" w:leader="dot" w:pos="9628"/>
             </w:tabs>
             <w:rPr>
-              <w:rFonts w:asciiTheme="majorBidi" w:hAnsiTheme="majorBidi" w:cstheme="majorBidi"/>
+              <w:rFonts w:cstheme="minorBidi"/>
               <w:b w:val="0"/>
               <w:bCs w:val="0"/>
               <w:i w:val="0"/>
@@ -743,18 +736,18 @@
               <w14:ligatures w14:val="standardContextual"/>
             </w:rPr>
           </w:pPr>
-          <w:hyperlink w:anchor="_Toc226910851" w:history="1">
+          <w:hyperlink w:anchor="_Toc227940236" w:history="1">
             <w:r>
               <w:rPr>
                 <w:rStyle w:val="Hyperlink"/>
-                <w:rFonts w:asciiTheme="majorBidi" w:hAnsiTheme="majorBidi" w:cstheme="majorBidi"/>
+                <w:rFonts w:asciiTheme="majorBidi" w:hAnsiTheme="majorBidi"/>
                 <w:noProof/>
               </w:rPr>
               <w:t>1</w:t>
             </w:r>
             <w:r>
               <w:rPr>
-                <w:rFonts w:asciiTheme="majorBidi" w:hAnsiTheme="majorBidi" w:cstheme="majorBidi"/>
+                <w:rFonts w:cstheme="minorBidi"/>
                 <w:b w:val="0"/>
                 <w:bCs w:val="0"/>
                 <w:i w:val="0"/>
@@ -770,14 +763,13 @@
             <w:r>
               <w:rPr>
                 <w:rStyle w:val="Hyperlink"/>
-                <w:rFonts w:asciiTheme="majorBidi" w:hAnsiTheme="majorBidi" w:cstheme="majorBidi"/>
+                <w:rFonts w:asciiTheme="majorBidi" w:hAnsiTheme="majorBidi"/>
                 <w:noProof/>
               </w:rPr>
               <w:t>Introduction</w:t>
             </w:r>
             <w:r>
               <w:rPr>
-                <w:rFonts w:asciiTheme="majorBidi" w:hAnsiTheme="majorBidi" w:cstheme="majorBidi"/>
                 <w:noProof/>
                 <w:webHidden/>
               </w:rPr>
@@ -785,7 +777,6 @@
             </w:r>
             <w:r>
               <w:rPr>
-                <w:rFonts w:asciiTheme="majorBidi" w:hAnsiTheme="majorBidi" w:cstheme="majorBidi"/>
                 <w:noProof/>
                 <w:webHidden/>
               </w:rPr>
@@ -793,22 +784,19 @@
             </w:r>
             <w:r>
               <w:rPr>
-                <w:rFonts w:asciiTheme="majorBidi" w:hAnsiTheme="majorBidi" w:cstheme="majorBidi"/>
-                <w:noProof/>
-                <w:webHidden/>
-              </w:rPr>
-              <w:instrText xml:space="preserve"> PAGEREF _Toc226910851 \h </w:instrText>
-            </w:r>
-            <w:r>
-              <w:rPr>
-                <w:rFonts w:asciiTheme="majorBidi" w:hAnsiTheme="majorBidi" w:cstheme="majorBidi"/>
-                <w:noProof/>
-                <w:webHidden/>
-              </w:rPr>
-            </w:r>
-            <w:r>
-              <w:rPr>
-                <w:rFonts w:asciiTheme="majorBidi" w:hAnsiTheme="majorBidi" w:cstheme="majorBidi"/>
+                <w:noProof/>
+                <w:webHidden/>
+              </w:rPr>
+              <w:instrText xml:space="preserve"> PAGEREF _Toc227940236 \h </w:instrText>
+            </w:r>
+            <w:r>
+              <w:rPr>
+                <w:noProof/>
+                <w:webHidden/>
+              </w:rPr>
+            </w:r>
+            <w:r>
+              <w:rPr>
                 <w:noProof/>
                 <w:webHidden/>
               </w:rPr>
@@ -816,7 +804,6 @@
             </w:r>
             <w:r>
               <w:rPr>
-                <w:rFonts w:asciiTheme="majorBidi" w:hAnsiTheme="majorBidi" w:cstheme="majorBidi"/>
                 <w:noProof/>
                 <w:webHidden/>
               </w:rPr>
@@ -824,7 +811,6 @@
             </w:r>
             <w:r>
               <w:rPr>
-                <w:rFonts w:asciiTheme="majorBidi" w:hAnsiTheme="majorBidi" w:cstheme="majorBidi"/>
                 <w:noProof/>
                 <w:webHidden/>
               </w:rPr>
@@ -839,7 +825,7 @@
               <w:tab w:val="right" w:leader="dot" w:pos="9628"/>
             </w:tabs>
             <w:rPr>
-              <w:rFonts w:asciiTheme="majorBidi" w:hAnsiTheme="majorBidi" w:cstheme="majorBidi"/>
+              <w:rFonts w:cstheme="minorBidi"/>
               <w:b w:val="0"/>
               <w:bCs w:val="0"/>
               <w:noProof/>
@@ -850,18 +836,17 @@
               <w14:ligatures w14:val="standardContextual"/>
             </w:rPr>
           </w:pPr>
-          <w:hyperlink w:anchor="_Toc226910852" w:history="1">
+          <w:hyperlink w:anchor="_Toc227940237" w:history="1">
             <w:r>
               <w:rPr>
                 <w:rStyle w:val="Hyperlink"/>
-                <w:rFonts w:asciiTheme="majorBidi" w:hAnsiTheme="majorBidi" w:cstheme="majorBidi"/>
+                <w:rFonts w:asciiTheme="majorBidi" w:hAnsiTheme="majorBidi"/>
                 <w:noProof/>
               </w:rPr>
               <w:t>1.1   Purpose and scope of the report</w:t>
             </w:r>
             <w:r>
               <w:rPr>
-                <w:rFonts w:asciiTheme="majorBidi" w:hAnsiTheme="majorBidi" w:cstheme="majorBidi"/>
                 <w:noProof/>
                 <w:webHidden/>
               </w:rPr>
@@ -869,7 +854,6 @@
             </w:r>
             <w:r>
               <w:rPr>
-                <w:rFonts w:asciiTheme="majorBidi" w:hAnsiTheme="majorBidi" w:cstheme="majorBidi"/>
                 <w:noProof/>
                 <w:webHidden/>
               </w:rPr>
@@ -877,22 +861,19 @@
             </w:r>
             <w:r>
               <w:rPr>
-                <w:rFonts w:asciiTheme="majorBidi" w:hAnsiTheme="majorBidi" w:cstheme="majorBidi"/>
-                <w:noProof/>
-                <w:webHidden/>
-              </w:rPr>
-              <w:instrText xml:space="preserve"> PAGEREF _Toc226910852 \h </w:instrText>
-            </w:r>
-            <w:r>
-              <w:rPr>
-                <w:rFonts w:asciiTheme="majorBidi" w:hAnsiTheme="majorBidi" w:cstheme="majorBidi"/>
-                <w:noProof/>
-                <w:webHidden/>
-              </w:rPr>
-            </w:r>
-            <w:r>
-              <w:rPr>
-                <w:rFonts w:asciiTheme="majorBidi" w:hAnsiTheme="majorBidi" w:cstheme="majorBidi"/>
+                <w:noProof/>
+                <w:webHidden/>
+              </w:rPr>
+              <w:instrText xml:space="preserve"> PAGEREF _Toc227940237 \h </w:instrText>
+            </w:r>
+            <w:r>
+              <w:rPr>
+                <w:noProof/>
+                <w:webHidden/>
+              </w:rPr>
+            </w:r>
+            <w:r>
+              <w:rPr>
                 <w:noProof/>
                 <w:webHidden/>
               </w:rPr>
@@ -900,7 +881,6 @@
             </w:r>
             <w:r>
               <w:rPr>
-                <w:rFonts w:asciiTheme="majorBidi" w:hAnsiTheme="majorBidi" w:cstheme="majorBidi"/>
                 <w:noProof/>
                 <w:webHidden/>
               </w:rPr>
@@ -908,91 +888,6 @@
             </w:r>
             <w:r>
               <w:rPr>
-                <w:rFonts w:asciiTheme="majorBidi" w:hAnsiTheme="majorBidi" w:cstheme="majorBidi"/>
-                <w:noProof/>
-                <w:webHidden/>
-              </w:rPr>
-              <w:fldChar w:fldCharType="end"/>
-            </w:r>
-          </w:hyperlink>
-        </w:p>
-        <w:p>
-          <w:pPr>
-            <w:pStyle w:val="TOC2"/>
-            <w:tabs>
-              <w:tab w:val="right" w:leader="dot" w:pos="9628"/>
-            </w:tabs>
-            <w:rPr>
-              <w:rFonts w:asciiTheme="majorBidi" w:hAnsiTheme="majorBidi" w:cstheme="majorBidi"/>
-              <w:b w:val="0"/>
-              <w:bCs w:val="0"/>
-              <w:noProof/>
-              <w:kern w:val="2"/>
-              <w:sz w:val="24"/>
-              <w:szCs w:val="24"/>
-              <w:lang w:eastAsia="en-GB" w:bidi="ar-SA"/>
-              <w14:ligatures w14:val="standardContextual"/>
-            </w:rPr>
-          </w:pPr>
-          <w:hyperlink w:anchor="_Toc226910853" w:history="1">
-            <w:r>
-              <w:rPr>
-                <w:rStyle w:val="Hyperlink"/>
-                <w:rFonts w:asciiTheme="majorBidi" w:hAnsiTheme="majorBidi" w:cstheme="majorBidi"/>
-                <w:noProof/>
-              </w:rPr>
-              <w:t>1.2   Implemented Packages</w:t>
-            </w:r>
-            <w:r>
-              <w:rPr>
-                <w:rFonts w:asciiTheme="majorBidi" w:hAnsiTheme="majorBidi" w:cstheme="majorBidi"/>
-                <w:noProof/>
-                <w:webHidden/>
-              </w:rPr>
-              <w:tab/>
-            </w:r>
-            <w:r>
-              <w:rPr>
-                <w:rFonts w:asciiTheme="majorBidi" w:hAnsiTheme="majorBidi" w:cstheme="majorBidi"/>
-                <w:noProof/>
-                <w:webHidden/>
-              </w:rPr>
-              <w:fldChar w:fldCharType="begin"/>
-            </w:r>
-            <w:r>
-              <w:rPr>
-                <w:rFonts w:asciiTheme="majorBidi" w:hAnsiTheme="majorBidi" w:cstheme="majorBidi"/>
-                <w:noProof/>
-                <w:webHidden/>
-              </w:rPr>
-              <w:instrText xml:space="preserve"> PAGEREF _Toc226910853 \h </w:instrText>
-            </w:r>
-            <w:r>
-              <w:rPr>
-                <w:rFonts w:asciiTheme="majorBidi" w:hAnsiTheme="majorBidi" w:cstheme="majorBidi"/>
-                <w:noProof/>
-                <w:webHidden/>
-              </w:rPr>
-            </w:r>
-            <w:r>
-              <w:rPr>
-                <w:rFonts w:asciiTheme="majorBidi" w:hAnsiTheme="majorBidi" w:cstheme="majorBidi"/>
-                <w:noProof/>
-                <w:webHidden/>
-              </w:rPr>
-              <w:fldChar w:fldCharType="separate"/>
-            </w:r>
-            <w:r>
-              <w:rPr>
-                <w:rFonts w:asciiTheme="majorBidi" w:hAnsiTheme="majorBidi" w:cstheme="majorBidi"/>
-                <w:noProof/>
-                <w:webHidden/>
-              </w:rPr>
-              <w:t>3</w:t>
-            </w:r>
-            <w:r>
-              <w:rPr>
-                <w:rFonts w:asciiTheme="majorBidi" w:hAnsiTheme="majorBidi" w:cstheme="majorBidi"/>
                 <w:noProof/>
                 <w:webHidden/>
               </w:rPr>
@@ -1004,11 +899,11 @@
           <w:pPr>
             <w:pStyle w:val="TOC1"/>
             <w:tabs>
-              <w:tab w:val="left" w:pos="480"/>
+              <w:tab w:val="left" w:pos="440"/>
               <w:tab w:val="right" w:leader="dot" w:pos="9628"/>
             </w:tabs>
             <w:rPr>
-              <w:rFonts w:asciiTheme="majorBidi" w:hAnsiTheme="majorBidi" w:cstheme="majorBidi"/>
+              <w:rFonts w:cstheme="minorBidi"/>
               <w:b w:val="0"/>
               <w:bCs w:val="0"/>
               <w:i w:val="0"/>
@@ -1020,18 +915,18 @@
               <w14:ligatures w14:val="standardContextual"/>
             </w:rPr>
           </w:pPr>
-          <w:hyperlink w:anchor="_Toc226910854" w:history="1">
+          <w:hyperlink w:anchor="_Toc227940238" w:history="1">
             <w:r>
               <w:rPr>
                 <w:rStyle w:val="Hyperlink"/>
-                <w:rFonts w:asciiTheme="majorBidi" w:hAnsiTheme="majorBidi" w:cstheme="majorBidi"/>
+                <w:rFonts w:asciiTheme="majorBidi" w:hAnsiTheme="majorBidi"/>
                 <w:noProof/>
               </w:rPr>
               <w:t>2</w:t>
             </w:r>
             <w:r>
               <w:rPr>
-                <w:rFonts w:asciiTheme="majorBidi" w:hAnsiTheme="majorBidi" w:cstheme="majorBidi"/>
+                <w:rFonts w:cstheme="minorBidi"/>
                 <w:b w:val="0"/>
                 <w:bCs w:val="0"/>
                 <w:i w:val="0"/>
@@ -1047,14 +942,13 @@
             <w:r>
               <w:rPr>
                 <w:rStyle w:val="Hyperlink"/>
-                <w:rFonts w:asciiTheme="majorBidi" w:hAnsiTheme="majorBidi" w:cstheme="majorBidi"/>
+                <w:rFonts w:asciiTheme="majorBidi" w:hAnsiTheme="majorBidi"/>
                 <w:noProof/>
               </w:rPr>
               <w:t>Software Compilation and Project Structure</w:t>
             </w:r>
             <w:r>
               <w:rPr>
-                <w:rFonts w:asciiTheme="majorBidi" w:hAnsiTheme="majorBidi" w:cstheme="majorBidi"/>
                 <w:noProof/>
                 <w:webHidden/>
               </w:rPr>
@@ -1062,7 +956,6 @@
             </w:r>
             <w:r>
               <w:rPr>
-                <w:rFonts w:asciiTheme="majorBidi" w:hAnsiTheme="majorBidi" w:cstheme="majorBidi"/>
                 <w:noProof/>
                 <w:webHidden/>
               </w:rPr>
@@ -1070,22 +963,19 @@
             </w:r>
             <w:r>
               <w:rPr>
-                <w:rFonts w:asciiTheme="majorBidi" w:hAnsiTheme="majorBidi" w:cstheme="majorBidi"/>
-                <w:noProof/>
-                <w:webHidden/>
-              </w:rPr>
-              <w:instrText xml:space="preserve"> PAGEREF _Toc226910854 \h </w:instrText>
-            </w:r>
-            <w:r>
-              <w:rPr>
-                <w:rFonts w:asciiTheme="majorBidi" w:hAnsiTheme="majorBidi" w:cstheme="majorBidi"/>
-                <w:noProof/>
-                <w:webHidden/>
-              </w:rPr>
-            </w:r>
-            <w:r>
-              <w:rPr>
-                <w:rFonts w:asciiTheme="majorBidi" w:hAnsiTheme="majorBidi" w:cstheme="majorBidi"/>
+                <w:noProof/>
+                <w:webHidden/>
+              </w:rPr>
+              <w:instrText xml:space="preserve"> PAGEREF _Toc227940238 \h </w:instrText>
+            </w:r>
+            <w:r>
+              <w:rPr>
+                <w:noProof/>
+                <w:webHidden/>
+              </w:rPr>
+            </w:r>
+            <w:r>
+              <w:rPr>
                 <w:noProof/>
                 <w:webHidden/>
               </w:rPr>
@@ -1093,7 +983,6 @@
             </w:r>
             <w:r>
               <w:rPr>
-                <w:rFonts w:asciiTheme="majorBidi" w:hAnsiTheme="majorBidi" w:cstheme="majorBidi"/>
                 <w:noProof/>
                 <w:webHidden/>
               </w:rPr>
@@ -1101,7 +990,6 @@
             </w:r>
             <w:r>
               <w:rPr>
-                <w:rFonts w:asciiTheme="majorBidi" w:hAnsiTheme="majorBidi" w:cstheme="majorBidi"/>
                 <w:noProof/>
                 <w:webHidden/>
               </w:rPr>
@@ -1116,7 +1004,7 @@
               <w:tab w:val="right" w:leader="dot" w:pos="9628"/>
             </w:tabs>
             <w:rPr>
-              <w:rFonts w:asciiTheme="majorBidi" w:hAnsiTheme="majorBidi" w:cstheme="majorBidi"/>
+              <w:rFonts w:cstheme="minorBidi"/>
               <w:b w:val="0"/>
               <w:bCs w:val="0"/>
               <w:noProof/>
@@ -1127,18 +1015,17 @@
               <w14:ligatures w14:val="standardContextual"/>
             </w:rPr>
           </w:pPr>
-          <w:hyperlink w:anchor="_Toc226910855" w:history="1">
+          <w:hyperlink w:anchor="_Toc227940239" w:history="1">
             <w:r>
               <w:rPr>
                 <w:rStyle w:val="Hyperlink"/>
-                <w:rFonts w:asciiTheme="majorBidi" w:hAnsiTheme="majorBidi" w:cstheme="majorBidi"/>
-                <w:noProof/>
-              </w:rPr>
-              <w:t>2.1   Compilation</w:t>
-            </w:r>
-            <w:r>
-              <w:rPr>
-                <w:rFonts w:asciiTheme="majorBidi" w:hAnsiTheme="majorBidi" w:cstheme="majorBidi"/>
+                <w:rFonts w:asciiTheme="majorBidi" w:hAnsiTheme="majorBidi"/>
+                <w:noProof/>
+              </w:rPr>
+              <w:t>2.1   Software Compilation</w:t>
+            </w:r>
+            <w:r>
+              <w:rPr>
                 <w:noProof/>
                 <w:webHidden/>
               </w:rPr>
@@ -1146,7 +1033,6 @@
             </w:r>
             <w:r>
               <w:rPr>
-                <w:rFonts w:asciiTheme="majorBidi" w:hAnsiTheme="majorBidi" w:cstheme="majorBidi"/>
                 <w:noProof/>
                 <w:webHidden/>
               </w:rPr>
@@ -1154,22 +1040,19 @@
             </w:r>
             <w:r>
               <w:rPr>
-                <w:rFonts w:asciiTheme="majorBidi" w:hAnsiTheme="majorBidi" w:cstheme="majorBidi"/>
-                <w:noProof/>
-                <w:webHidden/>
-              </w:rPr>
-              <w:instrText xml:space="preserve"> PAGEREF _Toc226910855 \h </w:instrText>
-            </w:r>
-            <w:r>
-              <w:rPr>
-                <w:rFonts w:asciiTheme="majorBidi" w:hAnsiTheme="majorBidi" w:cstheme="majorBidi"/>
-                <w:noProof/>
-                <w:webHidden/>
-              </w:rPr>
-            </w:r>
-            <w:r>
-              <w:rPr>
-                <w:rFonts w:asciiTheme="majorBidi" w:hAnsiTheme="majorBidi" w:cstheme="majorBidi"/>
+                <w:noProof/>
+                <w:webHidden/>
+              </w:rPr>
+              <w:instrText xml:space="preserve"> PAGEREF _Toc227940239 \h </w:instrText>
+            </w:r>
+            <w:r>
+              <w:rPr>
+                <w:noProof/>
+                <w:webHidden/>
+              </w:rPr>
+            </w:r>
+            <w:r>
+              <w:rPr>
                 <w:noProof/>
                 <w:webHidden/>
               </w:rPr>
@@ -1177,7 +1060,6 @@
             </w:r>
             <w:r>
               <w:rPr>
-                <w:rFonts w:asciiTheme="majorBidi" w:hAnsiTheme="majorBidi" w:cstheme="majorBidi"/>
                 <w:noProof/>
                 <w:webHidden/>
               </w:rPr>
@@ -1185,7 +1067,6 @@
             </w:r>
             <w:r>
               <w:rPr>
-                <w:rFonts w:asciiTheme="majorBidi" w:hAnsiTheme="majorBidi" w:cstheme="majorBidi"/>
                 <w:noProof/>
                 <w:webHidden/>
               </w:rPr>
@@ -1200,7 +1081,7 @@
               <w:tab w:val="right" w:leader="dot" w:pos="9628"/>
             </w:tabs>
             <w:rPr>
-              <w:rFonts w:asciiTheme="majorBidi" w:hAnsiTheme="majorBidi" w:cstheme="majorBidi"/>
+              <w:rFonts w:cstheme="minorBidi"/>
               <w:b w:val="0"/>
               <w:bCs w:val="0"/>
               <w:noProof/>
@@ -1211,18 +1092,17 @@
               <w14:ligatures w14:val="standardContextual"/>
             </w:rPr>
           </w:pPr>
-          <w:hyperlink w:anchor="_Toc226910856" w:history="1">
+          <w:hyperlink w:anchor="_Toc227940240" w:history="1">
             <w:r>
               <w:rPr>
                 <w:rStyle w:val="Hyperlink"/>
-                <w:rFonts w:asciiTheme="majorBidi" w:hAnsiTheme="majorBidi" w:cstheme="majorBidi"/>
+                <w:rFonts w:asciiTheme="majorBidi" w:hAnsiTheme="majorBidi"/>
                 <w:noProof/>
               </w:rPr>
               <w:t>2.2   Project Structure</w:t>
             </w:r>
             <w:r>
               <w:rPr>
-                <w:rFonts w:asciiTheme="majorBidi" w:hAnsiTheme="majorBidi" w:cstheme="majorBidi"/>
                 <w:noProof/>
                 <w:webHidden/>
               </w:rPr>
@@ -1230,7 +1110,6 @@
             </w:r>
             <w:r>
               <w:rPr>
-                <w:rFonts w:asciiTheme="majorBidi" w:hAnsiTheme="majorBidi" w:cstheme="majorBidi"/>
                 <w:noProof/>
                 <w:webHidden/>
               </w:rPr>
@@ -1238,22 +1117,19 @@
             </w:r>
             <w:r>
               <w:rPr>
-                <w:rFonts w:asciiTheme="majorBidi" w:hAnsiTheme="majorBidi" w:cstheme="majorBidi"/>
-                <w:noProof/>
-                <w:webHidden/>
-              </w:rPr>
-              <w:instrText xml:space="preserve"> PAGEREF _Toc226910856 \h </w:instrText>
-            </w:r>
-            <w:r>
-              <w:rPr>
-                <w:rFonts w:asciiTheme="majorBidi" w:hAnsiTheme="majorBidi" w:cstheme="majorBidi"/>
-                <w:noProof/>
-                <w:webHidden/>
-              </w:rPr>
-            </w:r>
-            <w:r>
-              <w:rPr>
-                <w:rFonts w:asciiTheme="majorBidi" w:hAnsiTheme="majorBidi" w:cstheme="majorBidi"/>
+                <w:noProof/>
+                <w:webHidden/>
+              </w:rPr>
+              <w:instrText xml:space="preserve"> PAGEREF _Toc227940240 \h </w:instrText>
+            </w:r>
+            <w:r>
+              <w:rPr>
+                <w:noProof/>
+                <w:webHidden/>
+              </w:rPr>
+            </w:r>
+            <w:r>
+              <w:rPr>
                 <w:noProof/>
                 <w:webHidden/>
               </w:rPr>
@@ -1261,7 +1137,6 @@
             </w:r>
             <w:r>
               <w:rPr>
-                <w:rFonts w:asciiTheme="majorBidi" w:hAnsiTheme="majorBidi" w:cstheme="majorBidi"/>
                 <w:noProof/>
                 <w:webHidden/>
               </w:rPr>
@@ -1269,7 +1144,6 @@
             </w:r>
             <w:r>
               <w:rPr>
-                <w:rFonts w:asciiTheme="majorBidi" w:hAnsiTheme="majorBidi" w:cstheme="majorBidi"/>
                 <w:noProof/>
                 <w:webHidden/>
               </w:rPr>
@@ -1281,11 +1155,11 @@
           <w:pPr>
             <w:pStyle w:val="TOC1"/>
             <w:tabs>
-              <w:tab w:val="left" w:pos="480"/>
+              <w:tab w:val="left" w:pos="440"/>
               <w:tab w:val="right" w:leader="dot" w:pos="9628"/>
             </w:tabs>
             <w:rPr>
-              <w:rFonts w:asciiTheme="majorBidi" w:hAnsiTheme="majorBidi" w:cstheme="majorBidi"/>
+              <w:rFonts w:cstheme="minorBidi"/>
               <w:b w:val="0"/>
               <w:bCs w:val="0"/>
               <w:i w:val="0"/>
@@ -1297,18 +1171,18 @@
               <w14:ligatures w14:val="standardContextual"/>
             </w:rPr>
           </w:pPr>
-          <w:hyperlink w:anchor="_Toc226910857" w:history="1">
+          <w:hyperlink w:anchor="_Toc227940241" w:history="1">
             <w:r>
               <w:rPr>
                 <w:rStyle w:val="Hyperlink"/>
-                <w:rFonts w:asciiTheme="majorBidi" w:hAnsiTheme="majorBidi" w:cstheme="majorBidi"/>
+                <w:rFonts w:asciiTheme="majorBidi" w:hAnsiTheme="majorBidi"/>
                 <w:noProof/>
               </w:rPr>
               <w:t>3</w:t>
             </w:r>
             <w:r>
               <w:rPr>
-                <w:rFonts w:asciiTheme="majorBidi" w:hAnsiTheme="majorBidi" w:cstheme="majorBidi"/>
+                <w:rFonts w:cstheme="minorBidi"/>
                 <w:b w:val="0"/>
                 <w:bCs w:val="0"/>
                 <w:i w:val="0"/>
@@ -1324,14 +1198,13 @@
             <w:r>
               <w:rPr>
                 <w:rStyle w:val="Hyperlink"/>
-                <w:rFonts w:asciiTheme="majorBidi" w:hAnsiTheme="majorBidi" w:cstheme="majorBidi"/>
+                <w:rFonts w:asciiTheme="majorBidi" w:hAnsiTheme="majorBidi"/>
                 <w:noProof/>
               </w:rPr>
               <w:t>Run-Time Components and Deployment</w:t>
             </w:r>
             <w:r>
               <w:rPr>
-                <w:rFonts w:asciiTheme="majorBidi" w:hAnsiTheme="majorBidi" w:cstheme="majorBidi"/>
                 <w:noProof/>
                 <w:webHidden/>
               </w:rPr>
@@ -1339,7 +1212,6 @@
             </w:r>
             <w:r>
               <w:rPr>
-                <w:rFonts w:asciiTheme="majorBidi" w:hAnsiTheme="majorBidi" w:cstheme="majorBidi"/>
                 <w:noProof/>
                 <w:webHidden/>
               </w:rPr>
@@ -1347,22 +1219,19 @@
             </w:r>
             <w:r>
               <w:rPr>
-                <w:rFonts w:asciiTheme="majorBidi" w:hAnsiTheme="majorBidi" w:cstheme="majorBidi"/>
-                <w:noProof/>
-                <w:webHidden/>
-              </w:rPr>
-              <w:instrText xml:space="preserve"> PAGEREF _Toc226910857 \h </w:instrText>
-            </w:r>
-            <w:r>
-              <w:rPr>
-                <w:rFonts w:asciiTheme="majorBidi" w:hAnsiTheme="majorBidi" w:cstheme="majorBidi"/>
-                <w:noProof/>
-                <w:webHidden/>
-              </w:rPr>
-            </w:r>
-            <w:r>
-              <w:rPr>
-                <w:rFonts w:asciiTheme="majorBidi" w:hAnsiTheme="majorBidi" w:cstheme="majorBidi"/>
+                <w:noProof/>
+                <w:webHidden/>
+              </w:rPr>
+              <w:instrText xml:space="preserve"> PAGEREF _Toc227940241 \h </w:instrText>
+            </w:r>
+            <w:r>
+              <w:rPr>
+                <w:noProof/>
+                <w:webHidden/>
+              </w:rPr>
+            </w:r>
+            <w:r>
+              <w:rPr>
                 <w:noProof/>
                 <w:webHidden/>
               </w:rPr>
@@ -1370,15 +1239,13 @@
             </w:r>
             <w:r>
               <w:rPr>
-                <w:rFonts w:asciiTheme="majorBidi" w:hAnsiTheme="majorBidi" w:cstheme="majorBidi"/>
-                <w:noProof/>
-                <w:webHidden/>
-              </w:rPr>
-              <w:t>4</w:t>
-            </w:r>
-            <w:r>
-              <w:rPr>
-                <w:rFonts w:asciiTheme="majorBidi" w:hAnsiTheme="majorBidi" w:cstheme="majorBidi"/>
+                <w:noProof/>
+                <w:webHidden/>
+              </w:rPr>
+              <w:t>6</w:t>
+            </w:r>
+            <w:r>
+              <w:rPr>
                 <w:noProof/>
                 <w:webHidden/>
               </w:rPr>
@@ -1393,7 +1260,7 @@
               <w:tab w:val="right" w:leader="dot" w:pos="9628"/>
             </w:tabs>
             <w:rPr>
-              <w:rFonts w:asciiTheme="majorBidi" w:hAnsiTheme="majorBidi" w:cstheme="majorBidi"/>
+              <w:rFonts w:cstheme="minorBidi"/>
               <w:b w:val="0"/>
               <w:bCs w:val="0"/>
               <w:noProof/>
@@ -1404,18 +1271,17 @@
               <w14:ligatures w14:val="standardContextual"/>
             </w:rPr>
           </w:pPr>
-          <w:hyperlink w:anchor="_Toc226910858" w:history="1">
+          <w:hyperlink w:anchor="_Toc227940242" w:history="1">
             <w:r>
               <w:rPr>
                 <w:rStyle w:val="Hyperlink"/>
-                <w:rFonts w:asciiTheme="majorBidi" w:hAnsiTheme="majorBidi" w:cstheme="majorBidi"/>
+                <w:rFonts w:asciiTheme="majorBidi" w:hAnsiTheme="majorBidi"/>
                 <w:noProof/>
               </w:rPr>
               <w:t>3.1   Run-Time Components</w:t>
             </w:r>
             <w:r>
               <w:rPr>
-                <w:rFonts w:asciiTheme="majorBidi" w:hAnsiTheme="majorBidi" w:cstheme="majorBidi"/>
                 <w:noProof/>
                 <w:webHidden/>
               </w:rPr>
@@ -1423,7 +1289,6 @@
             </w:r>
             <w:r>
               <w:rPr>
-                <w:rFonts w:asciiTheme="majorBidi" w:hAnsiTheme="majorBidi" w:cstheme="majorBidi"/>
                 <w:noProof/>
                 <w:webHidden/>
               </w:rPr>
@@ -1431,22 +1296,19 @@
             </w:r>
             <w:r>
               <w:rPr>
-                <w:rFonts w:asciiTheme="majorBidi" w:hAnsiTheme="majorBidi" w:cstheme="majorBidi"/>
-                <w:noProof/>
-                <w:webHidden/>
-              </w:rPr>
-              <w:instrText xml:space="preserve"> PAGEREF _Toc226910858 \h </w:instrText>
-            </w:r>
-            <w:r>
-              <w:rPr>
-                <w:rFonts w:asciiTheme="majorBidi" w:hAnsiTheme="majorBidi" w:cstheme="majorBidi"/>
-                <w:noProof/>
-                <w:webHidden/>
-              </w:rPr>
-            </w:r>
-            <w:r>
-              <w:rPr>
-                <w:rFonts w:asciiTheme="majorBidi" w:hAnsiTheme="majorBidi" w:cstheme="majorBidi"/>
+                <w:noProof/>
+                <w:webHidden/>
+              </w:rPr>
+              <w:instrText xml:space="preserve"> PAGEREF _Toc227940242 \h </w:instrText>
+            </w:r>
+            <w:r>
+              <w:rPr>
+                <w:noProof/>
+                <w:webHidden/>
+              </w:rPr>
+            </w:r>
+            <w:r>
+              <w:rPr>
                 <w:noProof/>
                 <w:webHidden/>
               </w:rPr>
@@ -1454,15 +1316,13 @@
             </w:r>
             <w:r>
               <w:rPr>
-                <w:rFonts w:asciiTheme="majorBidi" w:hAnsiTheme="majorBidi" w:cstheme="majorBidi"/>
-                <w:noProof/>
-                <w:webHidden/>
-              </w:rPr>
-              <w:t>4</w:t>
-            </w:r>
-            <w:r>
-              <w:rPr>
-                <w:rFonts w:asciiTheme="majorBidi" w:hAnsiTheme="majorBidi" w:cstheme="majorBidi"/>
+                <w:noProof/>
+                <w:webHidden/>
+              </w:rPr>
+              <w:t>6</w:t>
+            </w:r>
+            <w:r>
+              <w:rPr>
                 <w:noProof/>
                 <w:webHidden/>
               </w:rPr>
@@ -1477,7 +1337,7 @@
               <w:tab w:val="right" w:leader="dot" w:pos="9628"/>
             </w:tabs>
             <w:rPr>
-              <w:rFonts w:asciiTheme="majorBidi" w:hAnsiTheme="majorBidi" w:cstheme="majorBidi"/>
+              <w:rFonts w:cstheme="minorBidi"/>
               <w:b w:val="0"/>
               <w:bCs w:val="0"/>
               <w:noProof/>
@@ -1488,18 +1348,17 @@
               <w14:ligatures w14:val="standardContextual"/>
             </w:rPr>
           </w:pPr>
-          <w:hyperlink w:anchor="_Toc226910859" w:history="1">
+          <w:hyperlink w:anchor="_Toc227940243" w:history="1">
             <w:r>
               <w:rPr>
                 <w:rStyle w:val="Hyperlink"/>
-                <w:rFonts w:asciiTheme="majorBidi" w:hAnsiTheme="majorBidi" w:cstheme="majorBidi"/>
+                <w:rFonts w:asciiTheme="majorBidi" w:hAnsiTheme="majorBidi"/>
                 <w:noProof/>
               </w:rPr>
               <w:t>3.2   Deployment</w:t>
             </w:r>
             <w:r>
               <w:rPr>
-                <w:rFonts w:asciiTheme="majorBidi" w:hAnsiTheme="majorBidi" w:cstheme="majorBidi"/>
                 <w:noProof/>
                 <w:webHidden/>
               </w:rPr>
@@ -1507,7 +1366,6 @@
             </w:r>
             <w:r>
               <w:rPr>
-                <w:rFonts w:asciiTheme="majorBidi" w:hAnsiTheme="majorBidi" w:cstheme="majorBidi"/>
                 <w:noProof/>
                 <w:webHidden/>
               </w:rPr>
@@ -1515,22 +1373,19 @@
             </w:r>
             <w:r>
               <w:rPr>
-                <w:rFonts w:asciiTheme="majorBidi" w:hAnsiTheme="majorBidi" w:cstheme="majorBidi"/>
-                <w:noProof/>
-                <w:webHidden/>
-              </w:rPr>
-              <w:instrText xml:space="preserve"> PAGEREF _Toc226910859 \h </w:instrText>
-            </w:r>
-            <w:r>
-              <w:rPr>
-                <w:rFonts w:asciiTheme="majorBidi" w:hAnsiTheme="majorBidi" w:cstheme="majorBidi"/>
-                <w:noProof/>
-                <w:webHidden/>
-              </w:rPr>
-            </w:r>
-            <w:r>
-              <w:rPr>
-                <w:rFonts w:asciiTheme="majorBidi" w:hAnsiTheme="majorBidi" w:cstheme="majorBidi"/>
+                <w:noProof/>
+                <w:webHidden/>
+              </w:rPr>
+              <w:instrText xml:space="preserve"> PAGEREF _Toc227940243 \h </w:instrText>
+            </w:r>
+            <w:r>
+              <w:rPr>
+                <w:noProof/>
+                <w:webHidden/>
+              </w:rPr>
+            </w:r>
+            <w:r>
+              <w:rPr>
                 <w:noProof/>
                 <w:webHidden/>
               </w:rPr>
@@ -1538,15 +1393,13 @@
             </w:r>
             <w:r>
               <w:rPr>
-                <w:rFonts w:asciiTheme="majorBidi" w:hAnsiTheme="majorBidi" w:cstheme="majorBidi"/>
-                <w:noProof/>
-                <w:webHidden/>
-              </w:rPr>
-              <w:t>4</w:t>
-            </w:r>
-            <w:r>
-              <w:rPr>
-                <w:rFonts w:asciiTheme="majorBidi" w:hAnsiTheme="majorBidi" w:cstheme="majorBidi"/>
+                <w:noProof/>
+                <w:webHidden/>
+              </w:rPr>
+              <w:t>6</w:t>
+            </w:r>
+            <w:r>
+              <w:rPr>
                 <w:noProof/>
                 <w:webHidden/>
               </w:rPr>
@@ -1558,11 +1411,11 @@
           <w:pPr>
             <w:pStyle w:val="TOC1"/>
             <w:tabs>
-              <w:tab w:val="left" w:pos="480"/>
+              <w:tab w:val="left" w:pos="440"/>
               <w:tab w:val="right" w:leader="dot" w:pos="9628"/>
             </w:tabs>
             <w:rPr>
-              <w:rFonts w:asciiTheme="majorBidi" w:hAnsiTheme="majorBidi" w:cstheme="majorBidi"/>
+              <w:rFonts w:cstheme="minorBidi"/>
               <w:b w:val="0"/>
               <w:bCs w:val="0"/>
               <w:i w:val="0"/>
@@ -1574,18 +1427,18 @@
               <w14:ligatures w14:val="standardContextual"/>
             </w:rPr>
           </w:pPr>
-          <w:hyperlink w:anchor="_Toc226910860" w:history="1">
+          <w:hyperlink w:anchor="_Toc227940244" w:history="1">
             <w:r>
               <w:rPr>
                 <w:rStyle w:val="Hyperlink"/>
-                <w:rFonts w:asciiTheme="majorBidi" w:hAnsiTheme="majorBidi" w:cstheme="majorBidi"/>
+                <w:rFonts w:asciiTheme="majorBidi" w:hAnsiTheme="majorBidi"/>
                 <w:noProof/>
               </w:rPr>
               <w:t>4</w:t>
             </w:r>
             <w:r>
               <w:rPr>
-                <w:rFonts w:asciiTheme="majorBidi" w:hAnsiTheme="majorBidi" w:cstheme="majorBidi"/>
+                <w:rFonts w:cstheme="minorBidi"/>
                 <w:b w:val="0"/>
                 <w:bCs w:val="0"/>
                 <w:i w:val="0"/>
@@ -1601,14 +1454,13 @@
             <w:r>
               <w:rPr>
                 <w:rStyle w:val="Hyperlink"/>
-                <w:rFonts w:asciiTheme="majorBidi" w:hAnsiTheme="majorBidi" w:cstheme="majorBidi"/>
+                <w:rFonts w:asciiTheme="majorBidi" w:hAnsiTheme="majorBidi"/>
                 <w:noProof/>
               </w:rPr>
               <w:t>Testing Plan and Results</w:t>
             </w:r>
             <w:r>
               <w:rPr>
-                <w:rFonts w:asciiTheme="majorBidi" w:hAnsiTheme="majorBidi" w:cstheme="majorBidi"/>
                 <w:noProof/>
                 <w:webHidden/>
               </w:rPr>
@@ -1616,7 +1468,6 @@
             </w:r>
             <w:r>
               <w:rPr>
-                <w:rFonts w:asciiTheme="majorBidi" w:hAnsiTheme="majorBidi" w:cstheme="majorBidi"/>
                 <w:noProof/>
                 <w:webHidden/>
               </w:rPr>
@@ -1624,22 +1475,19 @@
             </w:r>
             <w:r>
               <w:rPr>
-                <w:rFonts w:asciiTheme="majorBidi" w:hAnsiTheme="majorBidi" w:cstheme="majorBidi"/>
-                <w:noProof/>
-                <w:webHidden/>
-              </w:rPr>
-              <w:instrText xml:space="preserve"> PAGEREF _Toc226910860 \h </w:instrText>
-            </w:r>
-            <w:r>
-              <w:rPr>
-                <w:rFonts w:asciiTheme="majorBidi" w:hAnsiTheme="majorBidi" w:cstheme="majorBidi"/>
-                <w:noProof/>
-                <w:webHidden/>
-              </w:rPr>
-            </w:r>
-            <w:r>
-              <w:rPr>
-                <w:rFonts w:asciiTheme="majorBidi" w:hAnsiTheme="majorBidi" w:cstheme="majorBidi"/>
+                <w:noProof/>
+                <w:webHidden/>
+              </w:rPr>
+              <w:instrText xml:space="preserve"> PAGEREF _Toc227940244 \h </w:instrText>
+            </w:r>
+            <w:r>
+              <w:rPr>
+                <w:noProof/>
+                <w:webHidden/>
+              </w:rPr>
+            </w:r>
+            <w:r>
+              <w:rPr>
                 <w:noProof/>
                 <w:webHidden/>
               </w:rPr>
@@ -1647,15 +1495,13 @@
             </w:r>
             <w:r>
               <w:rPr>
-                <w:rFonts w:asciiTheme="majorBidi" w:hAnsiTheme="majorBidi" w:cstheme="majorBidi"/>
-                <w:noProof/>
-                <w:webHidden/>
-              </w:rPr>
-              <w:t>4</w:t>
-            </w:r>
-            <w:r>
-              <w:rPr>
-                <w:rFonts w:asciiTheme="majorBidi" w:hAnsiTheme="majorBidi" w:cstheme="majorBidi"/>
+                <w:noProof/>
+                <w:webHidden/>
+              </w:rPr>
+              <w:t>6</w:t>
+            </w:r>
+            <w:r>
+              <w:rPr>
                 <w:noProof/>
                 <w:webHidden/>
               </w:rPr>
@@ -1670,7 +1516,7 @@
               <w:tab w:val="right" w:leader="dot" w:pos="9628"/>
             </w:tabs>
             <w:rPr>
-              <w:rFonts w:asciiTheme="majorBidi" w:hAnsiTheme="majorBidi" w:cstheme="majorBidi"/>
+              <w:rFonts w:cstheme="minorBidi"/>
               <w:b w:val="0"/>
               <w:bCs w:val="0"/>
               <w:noProof/>
@@ -1681,18 +1527,17 @@
               <w14:ligatures w14:val="standardContextual"/>
             </w:rPr>
           </w:pPr>
-          <w:hyperlink w:anchor="_Toc226910861" w:history="1">
+          <w:hyperlink w:anchor="_Toc227940245" w:history="1">
             <w:r>
               <w:rPr>
                 <w:rStyle w:val="Hyperlink"/>
-                <w:rFonts w:asciiTheme="majorBidi" w:hAnsiTheme="majorBidi" w:cstheme="majorBidi"/>
+                <w:rFonts w:asciiTheme="majorBidi" w:hAnsiTheme="majorBidi"/>
                 <w:noProof/>
               </w:rPr>
               <w:t>4.1   Unit Testing</w:t>
             </w:r>
             <w:r>
               <w:rPr>
-                <w:rFonts w:asciiTheme="majorBidi" w:hAnsiTheme="majorBidi" w:cstheme="majorBidi"/>
                 <w:noProof/>
                 <w:webHidden/>
               </w:rPr>
@@ -1700,7 +1545,6 @@
             </w:r>
             <w:r>
               <w:rPr>
-                <w:rFonts w:asciiTheme="majorBidi" w:hAnsiTheme="majorBidi" w:cstheme="majorBidi"/>
                 <w:noProof/>
                 <w:webHidden/>
               </w:rPr>
@@ -1708,22 +1552,19 @@
             </w:r>
             <w:r>
               <w:rPr>
-                <w:rFonts w:asciiTheme="majorBidi" w:hAnsiTheme="majorBidi" w:cstheme="majorBidi"/>
-                <w:noProof/>
-                <w:webHidden/>
-              </w:rPr>
-              <w:instrText xml:space="preserve"> PAGEREF _Toc226910861 \h </w:instrText>
-            </w:r>
-            <w:r>
-              <w:rPr>
-                <w:rFonts w:asciiTheme="majorBidi" w:hAnsiTheme="majorBidi" w:cstheme="majorBidi"/>
-                <w:noProof/>
-                <w:webHidden/>
-              </w:rPr>
-            </w:r>
-            <w:r>
-              <w:rPr>
-                <w:rFonts w:asciiTheme="majorBidi" w:hAnsiTheme="majorBidi" w:cstheme="majorBidi"/>
+                <w:noProof/>
+                <w:webHidden/>
+              </w:rPr>
+              <w:instrText xml:space="preserve"> PAGEREF _Toc227940245 \h </w:instrText>
+            </w:r>
+            <w:r>
+              <w:rPr>
+                <w:noProof/>
+                <w:webHidden/>
+              </w:rPr>
+            </w:r>
+            <w:r>
+              <w:rPr>
                 <w:noProof/>
                 <w:webHidden/>
               </w:rPr>
@@ -1731,15 +1572,13 @@
             </w:r>
             <w:r>
               <w:rPr>
-                <w:rFonts w:asciiTheme="majorBidi" w:hAnsiTheme="majorBidi" w:cstheme="majorBidi"/>
-                <w:noProof/>
-                <w:webHidden/>
-              </w:rPr>
-              <w:t>4</w:t>
-            </w:r>
-            <w:r>
-              <w:rPr>
-                <w:rFonts w:asciiTheme="majorBidi" w:hAnsiTheme="majorBidi" w:cstheme="majorBidi"/>
+                <w:noProof/>
+                <w:webHidden/>
+              </w:rPr>
+              <w:t>6</w:t>
+            </w:r>
+            <w:r>
+              <w:rPr>
                 <w:noProof/>
                 <w:webHidden/>
               </w:rPr>
@@ -1754,7 +1593,7 @@
               <w:tab w:val="right" w:leader="dot" w:pos="9628"/>
             </w:tabs>
             <w:rPr>
-              <w:rFonts w:asciiTheme="majorBidi" w:hAnsiTheme="majorBidi" w:cstheme="majorBidi"/>
+              <w:rFonts w:cstheme="minorBidi"/>
               <w:b w:val="0"/>
               <w:bCs w:val="0"/>
               <w:noProof/>
@@ -1765,18 +1604,17 @@
               <w14:ligatures w14:val="standardContextual"/>
             </w:rPr>
           </w:pPr>
-          <w:hyperlink w:anchor="_Toc226910862" w:history="1">
+          <w:hyperlink w:anchor="_Toc227940246" w:history="1">
             <w:r>
               <w:rPr>
                 <w:rStyle w:val="Hyperlink"/>
-                <w:rFonts w:asciiTheme="majorBidi" w:hAnsiTheme="majorBidi" w:cstheme="majorBidi"/>
+                <w:rFonts w:asciiTheme="majorBidi" w:hAnsiTheme="majorBidi"/>
                 <w:noProof/>
               </w:rPr>
               <w:t>4.2   Subsystem Testing</w:t>
             </w:r>
             <w:r>
               <w:rPr>
-                <w:rFonts w:asciiTheme="majorBidi" w:hAnsiTheme="majorBidi" w:cstheme="majorBidi"/>
                 <w:noProof/>
                 <w:webHidden/>
               </w:rPr>
@@ -1784,7 +1622,6 @@
             </w:r>
             <w:r>
               <w:rPr>
-                <w:rFonts w:asciiTheme="majorBidi" w:hAnsiTheme="majorBidi" w:cstheme="majorBidi"/>
                 <w:noProof/>
                 <w:webHidden/>
               </w:rPr>
@@ -1792,22 +1629,19 @@
             </w:r>
             <w:r>
               <w:rPr>
-                <w:rFonts w:asciiTheme="majorBidi" w:hAnsiTheme="majorBidi" w:cstheme="majorBidi"/>
-                <w:noProof/>
-                <w:webHidden/>
-              </w:rPr>
-              <w:instrText xml:space="preserve"> PAGEREF _Toc226910862 \h </w:instrText>
-            </w:r>
-            <w:r>
-              <w:rPr>
-                <w:rFonts w:asciiTheme="majorBidi" w:hAnsiTheme="majorBidi" w:cstheme="majorBidi"/>
-                <w:noProof/>
-                <w:webHidden/>
-              </w:rPr>
-            </w:r>
-            <w:r>
-              <w:rPr>
-                <w:rFonts w:asciiTheme="majorBidi" w:hAnsiTheme="majorBidi" w:cstheme="majorBidi"/>
+                <w:noProof/>
+                <w:webHidden/>
+              </w:rPr>
+              <w:instrText xml:space="preserve"> PAGEREF _Toc227940246 \h </w:instrText>
+            </w:r>
+            <w:r>
+              <w:rPr>
+                <w:noProof/>
+                <w:webHidden/>
+              </w:rPr>
+            </w:r>
+            <w:r>
+              <w:rPr>
                 <w:noProof/>
                 <w:webHidden/>
               </w:rPr>
@@ -1815,15 +1649,13 @@
             </w:r>
             <w:r>
               <w:rPr>
-                <w:rFonts w:asciiTheme="majorBidi" w:hAnsiTheme="majorBidi" w:cstheme="majorBidi"/>
-                <w:noProof/>
-                <w:webHidden/>
-              </w:rPr>
-              <w:t>4</w:t>
-            </w:r>
-            <w:r>
-              <w:rPr>
-                <w:rFonts w:asciiTheme="majorBidi" w:hAnsiTheme="majorBidi" w:cstheme="majorBidi"/>
+                <w:noProof/>
+                <w:webHidden/>
+              </w:rPr>
+              <w:t>6</w:t>
+            </w:r>
+            <w:r>
+              <w:rPr>
                 <w:noProof/>
                 <w:webHidden/>
               </w:rPr>
@@ -1838,7 +1670,7 @@
               <w:tab w:val="right" w:leader="dot" w:pos="9628"/>
             </w:tabs>
             <w:rPr>
-              <w:rFonts w:asciiTheme="majorBidi" w:hAnsiTheme="majorBidi" w:cstheme="majorBidi"/>
+              <w:rFonts w:cstheme="minorBidi"/>
               <w:b w:val="0"/>
               <w:bCs w:val="0"/>
               <w:noProof/>
@@ -1849,18 +1681,17 @@
               <w14:ligatures w14:val="standardContextual"/>
             </w:rPr>
           </w:pPr>
-          <w:hyperlink w:anchor="_Toc226910863" w:history="1">
+          <w:hyperlink w:anchor="_Toc227940247" w:history="1">
             <w:r>
               <w:rPr>
                 <w:rStyle w:val="Hyperlink"/>
-                <w:rFonts w:asciiTheme="majorBidi" w:hAnsiTheme="majorBidi" w:cstheme="majorBidi"/>
+                <w:rFonts w:asciiTheme="majorBidi" w:hAnsiTheme="majorBidi"/>
                 <w:noProof/>
               </w:rPr>
               <w:t>4.3   Required Interface Testing</w:t>
             </w:r>
             <w:r>
               <w:rPr>
-                <w:rFonts w:asciiTheme="majorBidi" w:hAnsiTheme="majorBidi" w:cstheme="majorBidi"/>
                 <w:noProof/>
                 <w:webHidden/>
               </w:rPr>
@@ -1868,7 +1699,6 @@
             </w:r>
             <w:r>
               <w:rPr>
-                <w:rFonts w:asciiTheme="majorBidi" w:hAnsiTheme="majorBidi" w:cstheme="majorBidi"/>
                 <w:noProof/>
                 <w:webHidden/>
               </w:rPr>
@@ -1876,22 +1706,19 @@
             </w:r>
             <w:r>
               <w:rPr>
-                <w:rFonts w:asciiTheme="majorBidi" w:hAnsiTheme="majorBidi" w:cstheme="majorBidi"/>
-                <w:noProof/>
-                <w:webHidden/>
-              </w:rPr>
-              <w:instrText xml:space="preserve"> PAGEREF _Toc226910863 \h </w:instrText>
-            </w:r>
-            <w:r>
-              <w:rPr>
-                <w:rFonts w:asciiTheme="majorBidi" w:hAnsiTheme="majorBidi" w:cstheme="majorBidi"/>
-                <w:noProof/>
-                <w:webHidden/>
-              </w:rPr>
-            </w:r>
-            <w:r>
-              <w:rPr>
-                <w:rFonts w:asciiTheme="majorBidi" w:hAnsiTheme="majorBidi" w:cstheme="majorBidi"/>
+                <w:noProof/>
+                <w:webHidden/>
+              </w:rPr>
+              <w:instrText xml:space="preserve"> PAGEREF _Toc227940247 \h </w:instrText>
+            </w:r>
+            <w:r>
+              <w:rPr>
+                <w:noProof/>
+                <w:webHidden/>
+              </w:rPr>
+            </w:r>
+            <w:r>
+              <w:rPr>
                 <w:noProof/>
                 <w:webHidden/>
               </w:rPr>
@@ -1899,15 +1726,13 @@
             </w:r>
             <w:r>
               <w:rPr>
-                <w:rFonts w:asciiTheme="majorBidi" w:hAnsiTheme="majorBidi" w:cstheme="majorBidi"/>
-                <w:noProof/>
-                <w:webHidden/>
-              </w:rPr>
-              <w:t>4</w:t>
-            </w:r>
-            <w:r>
-              <w:rPr>
-                <w:rFonts w:asciiTheme="majorBidi" w:hAnsiTheme="majorBidi" w:cstheme="majorBidi"/>
+                <w:noProof/>
+                <w:webHidden/>
+              </w:rPr>
+              <w:t>6</w:t>
+            </w:r>
+            <w:r>
+              <w:rPr>
                 <w:noProof/>
                 <w:webHidden/>
               </w:rPr>
@@ -1922,7 +1747,7 @@
               <w:tab w:val="right" w:leader="dot" w:pos="9628"/>
             </w:tabs>
             <w:rPr>
-              <w:rFonts w:asciiTheme="majorBidi" w:hAnsiTheme="majorBidi" w:cstheme="majorBidi"/>
+              <w:rFonts w:cstheme="minorBidi"/>
               <w:b w:val="0"/>
               <w:bCs w:val="0"/>
               <w:noProof/>
@@ -1933,18 +1758,17 @@
               <w14:ligatures w14:val="standardContextual"/>
             </w:rPr>
           </w:pPr>
-          <w:hyperlink w:anchor="_Toc226910864" w:history="1">
+          <w:hyperlink w:anchor="_Toc227940248" w:history="1">
             <w:r>
               <w:rPr>
                 <w:rStyle w:val="Hyperlink"/>
-                <w:rFonts w:asciiTheme="majorBidi" w:hAnsiTheme="majorBidi" w:cstheme="majorBidi"/>
+                <w:rFonts w:asciiTheme="majorBidi" w:hAnsiTheme="majorBidi"/>
                 <w:noProof/>
               </w:rPr>
               <w:t>4.4   Non-Functional Testing</w:t>
             </w:r>
             <w:r>
               <w:rPr>
-                <w:rFonts w:asciiTheme="majorBidi" w:hAnsiTheme="majorBidi" w:cstheme="majorBidi"/>
                 <w:noProof/>
                 <w:webHidden/>
               </w:rPr>
@@ -1952,7 +1776,6 @@
             </w:r>
             <w:r>
               <w:rPr>
-                <w:rFonts w:asciiTheme="majorBidi" w:hAnsiTheme="majorBidi" w:cstheme="majorBidi"/>
                 <w:noProof/>
                 <w:webHidden/>
               </w:rPr>
@@ -1960,22 +1783,19 @@
             </w:r>
             <w:r>
               <w:rPr>
-                <w:rFonts w:asciiTheme="majorBidi" w:hAnsiTheme="majorBidi" w:cstheme="majorBidi"/>
-                <w:noProof/>
-                <w:webHidden/>
-              </w:rPr>
-              <w:instrText xml:space="preserve"> PAGEREF _Toc226910864 \h </w:instrText>
-            </w:r>
-            <w:r>
-              <w:rPr>
-                <w:rFonts w:asciiTheme="majorBidi" w:hAnsiTheme="majorBidi" w:cstheme="majorBidi"/>
-                <w:noProof/>
-                <w:webHidden/>
-              </w:rPr>
-            </w:r>
-            <w:r>
-              <w:rPr>
-                <w:rFonts w:asciiTheme="majorBidi" w:hAnsiTheme="majorBidi" w:cstheme="majorBidi"/>
+                <w:noProof/>
+                <w:webHidden/>
+              </w:rPr>
+              <w:instrText xml:space="preserve"> PAGEREF _Toc227940248 \h </w:instrText>
+            </w:r>
+            <w:r>
+              <w:rPr>
+                <w:noProof/>
+                <w:webHidden/>
+              </w:rPr>
+            </w:r>
+            <w:r>
+              <w:rPr>
                 <w:noProof/>
                 <w:webHidden/>
               </w:rPr>
@@ -1983,15 +1803,13 @@
             </w:r>
             <w:r>
               <w:rPr>
-                <w:rFonts w:asciiTheme="majorBidi" w:hAnsiTheme="majorBidi" w:cstheme="majorBidi"/>
-                <w:noProof/>
-                <w:webHidden/>
-              </w:rPr>
-              <w:t>5</w:t>
-            </w:r>
-            <w:r>
-              <w:rPr>
-                <w:rFonts w:asciiTheme="majorBidi" w:hAnsiTheme="majorBidi" w:cstheme="majorBidi"/>
+                <w:noProof/>
+                <w:webHidden/>
+              </w:rPr>
+              <w:t>6</w:t>
+            </w:r>
+            <w:r>
+              <w:rPr>
                 <w:noProof/>
                 <w:webHidden/>
               </w:rPr>
@@ -2003,11 +1821,11 @@
           <w:pPr>
             <w:pStyle w:val="TOC1"/>
             <w:tabs>
-              <w:tab w:val="left" w:pos="480"/>
+              <w:tab w:val="left" w:pos="440"/>
               <w:tab w:val="right" w:leader="dot" w:pos="9628"/>
             </w:tabs>
             <w:rPr>
-              <w:rFonts w:asciiTheme="majorBidi" w:hAnsiTheme="majorBidi" w:cstheme="majorBidi"/>
+              <w:rFonts w:cstheme="minorBidi"/>
               <w:b w:val="0"/>
               <w:bCs w:val="0"/>
               <w:i w:val="0"/>
@@ -2019,18 +1837,18 @@
               <w14:ligatures w14:val="standardContextual"/>
             </w:rPr>
           </w:pPr>
-          <w:hyperlink w:anchor="_Toc226910865" w:history="1">
+          <w:hyperlink w:anchor="_Toc227940249" w:history="1">
             <w:r>
               <w:rPr>
                 <w:rStyle w:val="Hyperlink"/>
-                <w:rFonts w:asciiTheme="majorBidi" w:hAnsiTheme="majorBidi" w:cstheme="majorBidi"/>
+                <w:rFonts w:asciiTheme="majorBidi" w:hAnsiTheme="majorBidi"/>
                 <w:noProof/>
               </w:rPr>
               <w:t>5</w:t>
             </w:r>
             <w:r>
               <w:rPr>
-                <w:rFonts w:asciiTheme="majorBidi" w:hAnsiTheme="majorBidi" w:cstheme="majorBidi"/>
+                <w:rFonts w:cstheme="minorBidi"/>
                 <w:b w:val="0"/>
                 <w:bCs w:val="0"/>
                 <w:i w:val="0"/>
@@ -2046,14 +1864,13 @@
             <w:r>
               <w:rPr>
                 <w:rStyle w:val="Hyperlink"/>
-                <w:rFonts w:asciiTheme="majorBidi" w:hAnsiTheme="majorBidi" w:cstheme="majorBidi"/>
+                <w:rFonts w:asciiTheme="majorBidi" w:hAnsiTheme="majorBidi"/>
                 <w:noProof/>
               </w:rPr>
               <w:t>Conclusion</w:t>
             </w:r>
             <w:r>
               <w:rPr>
-                <w:rFonts w:asciiTheme="majorBidi" w:hAnsiTheme="majorBidi" w:cstheme="majorBidi"/>
                 <w:noProof/>
                 <w:webHidden/>
               </w:rPr>
@@ -2061,7 +1878,6 @@
             </w:r>
             <w:r>
               <w:rPr>
-                <w:rFonts w:asciiTheme="majorBidi" w:hAnsiTheme="majorBidi" w:cstheme="majorBidi"/>
                 <w:noProof/>
                 <w:webHidden/>
               </w:rPr>
@@ -2069,22 +1885,19 @@
             </w:r>
             <w:r>
               <w:rPr>
-                <w:rFonts w:asciiTheme="majorBidi" w:hAnsiTheme="majorBidi" w:cstheme="majorBidi"/>
-                <w:noProof/>
-                <w:webHidden/>
-              </w:rPr>
-              <w:instrText xml:space="preserve"> PAGEREF _Toc226910865 \h </w:instrText>
-            </w:r>
-            <w:r>
-              <w:rPr>
-                <w:rFonts w:asciiTheme="majorBidi" w:hAnsiTheme="majorBidi" w:cstheme="majorBidi"/>
-                <w:noProof/>
-                <w:webHidden/>
-              </w:rPr>
-            </w:r>
-            <w:r>
-              <w:rPr>
-                <w:rFonts w:asciiTheme="majorBidi" w:hAnsiTheme="majorBidi" w:cstheme="majorBidi"/>
+                <w:noProof/>
+                <w:webHidden/>
+              </w:rPr>
+              <w:instrText xml:space="preserve"> PAGEREF _Toc227940249 \h </w:instrText>
+            </w:r>
+            <w:r>
+              <w:rPr>
+                <w:noProof/>
+                <w:webHidden/>
+              </w:rPr>
+            </w:r>
+            <w:r>
+              <w:rPr>
                 <w:noProof/>
                 <w:webHidden/>
               </w:rPr>
@@ -2092,15 +1905,13 @@
             </w:r>
             <w:r>
               <w:rPr>
-                <w:rFonts w:asciiTheme="majorBidi" w:hAnsiTheme="majorBidi" w:cstheme="majorBidi"/>
-                <w:noProof/>
-                <w:webHidden/>
-              </w:rPr>
-              <w:t>5</w:t>
-            </w:r>
-            <w:r>
-              <w:rPr>
-                <w:rFonts w:asciiTheme="majorBidi" w:hAnsiTheme="majorBidi" w:cstheme="majorBidi"/>
+                <w:noProof/>
+                <w:webHidden/>
+              </w:rPr>
+              <w:t>6</w:t>
+            </w:r>
+            <w:r>
+              <w:rPr>
                 <w:noProof/>
                 <w:webHidden/>
               </w:rPr>
@@ -2115,7 +1926,7 @@
               <w:tab w:val="right" w:leader="dot" w:pos="9628"/>
             </w:tabs>
             <w:rPr>
-              <w:rFonts w:asciiTheme="majorBidi" w:hAnsiTheme="majorBidi" w:cstheme="majorBidi"/>
+              <w:rFonts w:cstheme="minorBidi"/>
               <w:b w:val="0"/>
               <w:bCs w:val="0"/>
               <w:i w:val="0"/>
@@ -2127,18 +1938,17 @@
               <w14:ligatures w14:val="standardContextual"/>
             </w:rPr>
           </w:pPr>
-          <w:hyperlink w:anchor="_Toc226910866" w:history="1">
+          <w:hyperlink w:anchor="_Toc227940250" w:history="1">
             <w:r>
               <w:rPr>
                 <w:rStyle w:val="Hyperlink"/>
-                <w:rFonts w:asciiTheme="majorBidi" w:hAnsiTheme="majorBidi" w:cstheme="majorBidi"/>
+                <w:rFonts w:asciiTheme="majorBidi" w:hAnsiTheme="majorBidi"/>
                 <w:noProof/>
               </w:rPr>
               <w:t>Appendix:</w:t>
             </w:r>
             <w:r>
               <w:rPr>
-                <w:rFonts w:asciiTheme="majorBidi" w:hAnsiTheme="majorBidi" w:cstheme="majorBidi"/>
                 <w:noProof/>
                 <w:webHidden/>
               </w:rPr>
@@ -2146,7 +1956,6 @@
             </w:r>
             <w:r>
               <w:rPr>
-                <w:rFonts w:asciiTheme="majorBidi" w:hAnsiTheme="majorBidi" w:cstheme="majorBidi"/>
                 <w:noProof/>
                 <w:webHidden/>
               </w:rPr>
@@ -2154,22 +1963,19 @@
             </w:r>
             <w:r>
               <w:rPr>
-                <w:rFonts w:asciiTheme="majorBidi" w:hAnsiTheme="majorBidi" w:cstheme="majorBidi"/>
-                <w:noProof/>
-                <w:webHidden/>
-              </w:rPr>
-              <w:instrText xml:space="preserve"> PAGEREF _Toc226910866 \h </w:instrText>
-            </w:r>
-            <w:r>
-              <w:rPr>
-                <w:rFonts w:asciiTheme="majorBidi" w:hAnsiTheme="majorBidi" w:cstheme="majorBidi"/>
-                <w:noProof/>
-                <w:webHidden/>
-              </w:rPr>
-            </w:r>
-            <w:r>
-              <w:rPr>
-                <w:rFonts w:asciiTheme="majorBidi" w:hAnsiTheme="majorBidi" w:cstheme="majorBidi"/>
+                <w:noProof/>
+                <w:webHidden/>
+              </w:rPr>
+              <w:instrText xml:space="preserve"> PAGEREF _Toc227940250 \h </w:instrText>
+            </w:r>
+            <w:r>
+              <w:rPr>
+                <w:noProof/>
+                <w:webHidden/>
+              </w:rPr>
+            </w:r>
+            <w:r>
+              <w:rPr>
                 <w:noProof/>
                 <w:webHidden/>
               </w:rPr>
@@ -2177,15 +1983,13 @@
             </w:r>
             <w:r>
               <w:rPr>
-                <w:rFonts w:asciiTheme="majorBidi" w:hAnsiTheme="majorBidi" w:cstheme="majorBidi"/>
-                <w:noProof/>
-                <w:webHidden/>
-              </w:rPr>
-              <w:t>5</w:t>
-            </w:r>
-            <w:r>
-              <w:rPr>
-                <w:rFonts w:asciiTheme="majorBidi" w:hAnsiTheme="majorBidi" w:cstheme="majorBidi"/>
+                <w:noProof/>
+                <w:webHidden/>
+              </w:rPr>
+              <w:t>6</w:t>
+            </w:r>
+            <w:r>
+              <w:rPr>
                 <w:noProof/>
                 <w:webHidden/>
               </w:rPr>
@@ -2196,9 +2000,7 @@
         <w:p>
           <w:pPr>
             <w:rPr>
-              <w:rFonts w:asciiTheme="majorBidi" w:hAnsiTheme="majorBidi" w:cstheme="majorBidi"/>
-              <w:b/>
-              <w:bCs/>
+              <w:rFonts w:asciiTheme="majorBidi" w:hAnsiTheme="majorBidi"/>
               <w:noProof/>
             </w:rPr>
           </w:pPr>
@@ -2212,115 +2014,100 @@
             <w:fldChar w:fldCharType="end"/>
           </w:r>
         </w:p>
-        <w:p>
-          <w:pPr>
-            <w:rPr>
-              <w:rFonts w:asciiTheme="majorBidi" w:hAnsiTheme="majorBidi" w:cstheme="majorBidi"/>
-              <w:b/>
-              <w:bCs/>
-              <w:noProof/>
-            </w:rPr>
-          </w:pPr>
-        </w:p>
-        <w:p>
-          <w:pPr>
-            <w:rPr>
-              <w:rFonts w:asciiTheme="majorBidi" w:hAnsiTheme="majorBidi" w:cstheme="majorBidi"/>
-              <w:b/>
-              <w:bCs/>
-              <w:noProof/>
-            </w:rPr>
-          </w:pPr>
-        </w:p>
-        <w:p>
-          <w:pPr>
-            <w:rPr>
-              <w:rFonts w:asciiTheme="majorBidi" w:hAnsiTheme="majorBidi" w:cstheme="majorBidi"/>
-              <w:b/>
-              <w:bCs/>
-              <w:noProof/>
-            </w:rPr>
-          </w:pPr>
-        </w:p>
-        <w:p>
-          <w:pPr>
-            <w:rPr>
-              <w:rFonts w:asciiTheme="majorBidi" w:hAnsiTheme="majorBidi" w:cstheme="majorBidi"/>
-              <w:b/>
-              <w:bCs/>
-              <w:noProof/>
-            </w:rPr>
-          </w:pPr>
-        </w:p>
-        <w:p>
-          <w:pPr>
-            <w:rPr>
-              <w:rFonts w:asciiTheme="majorBidi" w:hAnsiTheme="majorBidi" w:cstheme="majorBidi"/>
-              <w:b/>
-              <w:bCs/>
-              <w:noProof/>
-            </w:rPr>
-          </w:pPr>
-        </w:p>
-        <w:p>
-          <w:pPr>
-            <w:rPr>
-              <w:rFonts w:asciiTheme="majorBidi" w:hAnsiTheme="majorBidi" w:cstheme="majorBidi"/>
-              <w:b/>
-              <w:bCs/>
-              <w:noProof/>
-            </w:rPr>
-          </w:pPr>
-        </w:p>
-        <w:p>
-          <w:pPr>
-            <w:rPr>
-              <w:rFonts w:asciiTheme="majorBidi" w:hAnsiTheme="majorBidi" w:cstheme="majorBidi"/>
-              <w:b/>
-              <w:bCs/>
-              <w:noProof/>
-            </w:rPr>
-          </w:pPr>
-        </w:p>
-        <w:p>
-          <w:pPr>
-            <w:rPr>
-              <w:rFonts w:asciiTheme="majorBidi" w:hAnsiTheme="majorBidi" w:cstheme="majorBidi"/>
-              <w:b/>
-              <w:bCs/>
-              <w:noProof/>
-            </w:rPr>
-          </w:pPr>
-        </w:p>
-        <w:p>
-          <w:pPr>
-            <w:rPr>
-              <w:rFonts w:asciiTheme="majorBidi" w:hAnsiTheme="majorBidi" w:cstheme="majorBidi"/>
-              <w:b/>
-              <w:bCs/>
-              <w:noProof/>
-            </w:rPr>
-          </w:pPr>
-        </w:p>
-        <w:p>
-          <w:pPr>
-            <w:rPr>
-              <w:rFonts w:asciiTheme="majorBidi" w:hAnsiTheme="majorBidi" w:cstheme="majorBidi"/>
-              <w:b/>
-              <w:bCs/>
-              <w:noProof/>
-            </w:rPr>
-          </w:pPr>
-        </w:p>
-        <w:p>
-          <w:pPr>
-            <w:rPr>
-              <w:rFonts w:asciiTheme="majorBidi" w:hAnsiTheme="majorBidi" w:cstheme="majorBidi"/>
-            </w:rPr>
-          </w:pPr>
-        </w:p>
       </w:sdtContent>
     </w:sdt>
+    <w:p>
+      <w:pPr>
+        <w:rPr>
+          <w:rFonts w:asciiTheme="majorBidi" w:hAnsiTheme="majorBidi"/>
+          <w:noProof/>
+        </w:rPr>
+      </w:pPr>
+    </w:p>
+    <w:p>
+      <w:pPr>
+        <w:rPr>
+          <w:rFonts w:asciiTheme="majorBidi" w:hAnsiTheme="majorBidi"/>
+          <w:noProof/>
+        </w:rPr>
+      </w:pPr>
+    </w:p>
+    <w:p>
+      <w:pPr>
+        <w:rPr>
+          <w:rFonts w:asciiTheme="majorBidi" w:hAnsiTheme="majorBidi"/>
+          <w:noProof/>
+        </w:rPr>
+      </w:pPr>
+    </w:p>
+    <w:p>
+      <w:pPr>
+        <w:rPr>
+          <w:rFonts w:asciiTheme="majorBidi" w:hAnsiTheme="majorBidi"/>
+          <w:noProof/>
+        </w:rPr>
+      </w:pPr>
+    </w:p>
+    <w:p>
+      <w:pPr>
+        <w:rPr>
+          <w:rFonts w:asciiTheme="majorBidi" w:hAnsiTheme="majorBidi" w:cstheme="majorBidi"/>
+          <w:b/>
+          <w:bCs/>
+          <w:noProof/>
+        </w:rPr>
+      </w:pPr>
+    </w:p>
+    <w:p>
+      <w:pPr>
+        <w:rPr>
+          <w:rFonts w:asciiTheme="majorBidi" w:hAnsiTheme="majorBidi" w:cstheme="majorBidi"/>
+          <w:b/>
+          <w:bCs/>
+          <w:noProof/>
+        </w:rPr>
+      </w:pPr>
+    </w:p>
+    <w:p>
+      <w:pPr>
+        <w:rPr>
+          <w:rFonts w:asciiTheme="majorBidi" w:hAnsiTheme="majorBidi" w:cstheme="majorBidi"/>
+          <w:b/>
+          <w:bCs/>
+          <w:noProof/>
+        </w:rPr>
+      </w:pPr>
+    </w:p>
+    <w:p>
+      <w:pPr>
+        <w:rPr>
+          <w:rFonts w:asciiTheme="majorBidi" w:hAnsiTheme="majorBidi" w:cstheme="majorBidi"/>
+          <w:b/>
+          <w:bCs/>
+          <w:noProof/>
+        </w:rPr>
+      </w:pPr>
+    </w:p>
+    <w:p>
+      <w:pPr>
+        <w:rPr>
+          <w:rFonts w:asciiTheme="majorBidi" w:hAnsiTheme="majorBidi" w:cstheme="majorBidi"/>
+          <w:b/>
+          <w:bCs/>
+          <w:noProof/>
+        </w:rPr>
+      </w:pPr>
+    </w:p>
+    <w:p>
+      <w:pPr>
+        <w:rPr>
+          <w:rFonts w:asciiTheme="majorBidi" w:hAnsiTheme="majorBidi" w:cstheme="majorBidi"/>
+          <w:b/>
+          <w:bCs/>
+          <w:noProof/>
+        </w:rPr>
+      </w:pPr>
+    </w:p>
     <w:p>
       <w:pPr>
         <w:pStyle w:val="Heading1"/>
@@ -2332,7 +2119,7 @@
           <w:rFonts w:asciiTheme="majorBidi" w:hAnsiTheme="majorBidi"/>
         </w:rPr>
       </w:pPr>
-      <w:bookmarkStart w:id="1" w:name="_Toc226910851"/>
+      <w:bookmarkStart w:id="1" w:name="_Toc227940236"/>
       <w:r>
         <w:rPr>
           <w:rFonts w:asciiTheme="majorBidi" w:hAnsiTheme="majorBidi"/>
@@ -2350,7 +2137,7 @@
         </w:rPr>
       </w:pPr>
       <w:bookmarkStart w:id="2" w:name="__RefHeading___Toc3134_3044749200"/>
-      <w:bookmarkStart w:id="3" w:name="_Toc226910852"/>
+      <w:bookmarkStart w:id="3" w:name="_Toc227940237"/>
       <w:r>
         <w:rPr>
           <w:rFonts w:asciiTheme="majorBidi" w:hAnsiTheme="majorBidi"/>
@@ -2368,7 +2155,6 @@
     </w:p>
     <w:p>
       <w:pPr>
-        <w:spacing w:after="0" w:line="240" w:lineRule="auto"/>
         <w:rPr>
           <w:rFonts w:asciiTheme="majorBidi" w:eastAsia="Times New Roman" w:hAnsiTheme="majorBidi" w:cstheme="majorBidi"/>
           <w:lang w:eastAsia="en-GB" w:bidi="ar-SA"/>
@@ -2380,408 +2166,48 @@
           <w:rFonts w:asciiTheme="majorBidi" w:eastAsia="Times New Roman" w:hAnsiTheme="majorBidi" w:cstheme="majorBidi"/>
           <w:lang w:eastAsia="en-GB" w:bidi="ar-SA"/>
         </w:rPr>
-        <w:t xml:space="preserve">This report is the Implementation Report for the IPOS-PU (Online Platform) subsystem developed as part of the IN2033 Team Project. It covers how the system was </w:t>
-      </w:r>
-      <w:r>
+        <w:t>This report presents the implementation of the IPOS-PU subsystem developed as part of the IN2033 Team Project. It outlines how the system was designed and built including its compilation, structure, deployment, testing, and final class design.</w:t>
+      </w:r>
+    </w:p>
+    <w:p>
+      <w:pPr>
         <w:rPr>
           <w:rFonts w:asciiTheme="majorBidi" w:eastAsia="Times New Roman" w:hAnsiTheme="majorBidi" w:cstheme="majorBidi"/>
           <w:lang w:eastAsia="en-GB" w:bidi="ar-SA"/>
         </w:rPr>
-        <w:t>built including</w:t>
-      </w:r>
+      </w:pPr>
       <w:r>
         <w:rPr>
           <w:rFonts w:asciiTheme="majorBidi" w:eastAsia="Times New Roman" w:hAnsiTheme="majorBidi" w:cstheme="majorBidi"/>
           <w:lang w:eastAsia="en-GB" w:bidi="ar-SA"/>
         </w:rPr>
-        <w:t xml:space="preserve"> how it is compiled, structured, deployed, and tested</w:t>
-      </w:r>
-      <w:r>
+        <w:t>The IPOS-PU subsystem is an online platform developed in Java using JavaFX for the user interface and SQLite for data storage. It enables members of the public to register as either commercial or non-commercial users, browse products, and place orders. Commercial users are required to undergo an approval process before gaining full access to the system.</w:t>
+      </w:r>
+    </w:p>
+    <w:p>
+      <w:pPr>
         <w:rPr>
           <w:rFonts w:asciiTheme="majorBidi" w:eastAsia="Times New Roman" w:hAnsiTheme="majorBidi" w:cstheme="majorBidi"/>
           <w:lang w:eastAsia="en-GB" w:bidi="ar-SA"/>
         </w:rPr>
-        <w:t xml:space="preserve"> </w:t>
-      </w:r>
+      </w:pPr>
       <w:r>
         <w:rPr>
           <w:rFonts w:asciiTheme="majorBidi" w:eastAsia="Times New Roman" w:hAnsiTheme="majorBidi" w:cstheme="majorBidi"/>
           <w:lang w:eastAsia="en-GB" w:bidi="ar-SA"/>
         </w:rPr>
-        <w:t>as well as the final design class diagram.</w:t>
-      </w:r>
-    </w:p>
-    <w:p>
-      <w:pPr>
-        <w:spacing w:after="0" w:line="240" w:lineRule="auto"/>
-        <w:rPr>
-          <w:rFonts w:asciiTheme="majorBidi" w:eastAsia="Times New Roman" w:hAnsiTheme="majorBidi" w:cstheme="majorBidi"/>
-          <w:lang w:eastAsia="en-GB" w:bidi="ar-SA"/>
-        </w:rPr>
-      </w:pPr>
-    </w:p>
-    <w:p>
-      <w:pPr>
-        <w:spacing w:after="0" w:line="240" w:lineRule="auto"/>
-        <w:rPr>
-          <w:rFonts w:asciiTheme="majorBidi" w:eastAsia="Times New Roman" w:hAnsiTheme="majorBidi" w:cstheme="majorBidi"/>
-          <w:lang w:eastAsia="en-GB" w:bidi="ar-SA"/>
-        </w:rPr>
-      </w:pPr>
-      <w:r>
-        <w:rPr>
-          <w:rFonts w:asciiTheme="majorBidi" w:eastAsia="Times New Roman" w:hAnsiTheme="majorBidi" w:cstheme="majorBidi"/>
-          <w:lang w:eastAsia="en-GB" w:bidi="ar-SA"/>
-        </w:rPr>
-        <w:t>The IPOS-PU subsystem is an online platform built using Java, with JavaFX used for the user interface and SQLite for data storage. It allows members of the public to create accounts as either commercial or non-commercial users, browse products, and place orders. Commercial users must go through an approval process before they can fully access the system.</w:t>
-      </w:r>
-    </w:p>
-    <w:p>
-      <w:pPr>
-        <w:spacing w:after="0" w:line="240" w:lineRule="auto"/>
-        <w:rPr>
-          <w:rFonts w:asciiTheme="majorBidi" w:eastAsia="Times New Roman" w:hAnsiTheme="majorBidi" w:cstheme="majorBidi"/>
-          <w:lang w:eastAsia="en-GB" w:bidi="ar-SA"/>
-        </w:rPr>
-      </w:pPr>
-    </w:p>
-    <w:p>
-      <w:pPr>
-        <w:spacing w:after="0" w:line="240" w:lineRule="auto"/>
-        <w:rPr>
-          <w:rFonts w:asciiTheme="majorBidi" w:eastAsia="Times New Roman" w:hAnsiTheme="majorBidi" w:cstheme="majorBidi"/>
-          <w:lang w:eastAsia="en-GB" w:bidi="ar-SA"/>
-        </w:rPr>
-      </w:pPr>
-      <w:r>
-        <w:rPr>
-          <w:rFonts w:asciiTheme="majorBidi" w:eastAsia="Times New Roman" w:hAnsiTheme="majorBidi" w:cstheme="majorBidi"/>
-          <w:lang w:eastAsia="en-GB" w:bidi="ar-SA"/>
-        </w:rPr>
-        <w:t>The subsystem also connects with other parts of the InfoPharma system including IPOS-SA for handling orders and account</w:t>
-      </w:r>
-      <w:r>
-        <w:rPr>
-          <w:rFonts w:asciiTheme="majorBidi" w:eastAsia="Times New Roman" w:hAnsiTheme="majorBidi" w:cstheme="majorBidi"/>
-          <w:lang w:eastAsia="en-GB" w:bidi="ar-SA"/>
-        </w:rPr>
-        <w:t xml:space="preserve"> </w:t>
-      </w:r>
-      <w:r>
-        <w:rPr>
-          <w:rFonts w:asciiTheme="majorBidi" w:eastAsia="Times New Roman" w:hAnsiTheme="majorBidi" w:cstheme="majorBidi"/>
-          <w:lang w:eastAsia="en-GB" w:bidi="ar-SA"/>
-        </w:rPr>
-        <w:t>related processes and IPOS-CA for updating stock and fulfilling orders.</w:t>
-      </w:r>
-    </w:p>
-    <w:p>
-      <w:pPr>
-        <w:pStyle w:val="Heading2"/>
+        <w:t>The subsystem integrates with other components of the InfoPharma system including IPOS-SA for account management and order processing and IPOS-CA for stock updates and order fulfilment.</w:t>
+      </w:r>
+    </w:p>
+    <w:p>
+      <w:pPr>
+        <w:pStyle w:val="Heading1"/>
         <w:rPr>
           <w:rFonts w:asciiTheme="majorBidi" w:hAnsiTheme="majorBidi"/>
         </w:rPr>
       </w:pPr>
-      <w:bookmarkStart w:id="5" w:name="_Toc226910853"/>
-      <w:r>
-        <w:rPr>
-          <w:rFonts w:asciiTheme="majorBidi" w:hAnsiTheme="majorBidi"/>
-        </w:rPr>
-        <w:t>1.2   I</w:t>
-      </w:r>
+      <w:bookmarkStart w:id="5" w:name="_Toc227940238"/>
       <w:bookmarkEnd w:id="4"/>
-      <w:r>
-        <w:rPr>
-          <w:rFonts w:asciiTheme="majorBidi" w:hAnsiTheme="majorBidi"/>
-        </w:rPr>
-        <w:t>mplemented Packages</w:t>
-      </w:r>
-      <w:bookmarkEnd w:id="5"/>
-    </w:p>
-    <w:p>
-      <w:pPr>
-        <w:pStyle w:val="Textbody"/>
-        <w:rPr>
-          <w:rFonts w:asciiTheme="majorBidi" w:hAnsiTheme="majorBidi" w:cstheme="majorBidi"/>
-        </w:rPr>
-      </w:pPr>
-      <w:r>
-        <w:rPr>
-          <w:rFonts w:asciiTheme="majorBidi" w:hAnsiTheme="majorBidi" w:cstheme="majorBidi"/>
-        </w:rPr>
-        <w:t>The following IPOS-PU packages have been implemented:</w:t>
-      </w:r>
-    </w:p>
-    <w:p>
-      <w:pPr>
-        <w:pStyle w:val="ListParagraph"/>
-        <w:numPr>
-          <w:ilvl w:val="0"/>
-          <w:numId w:val="2"/>
-        </w:numPr>
-        <w:spacing w:after="0"/>
-        <w:rPr>
-          <w:rFonts w:asciiTheme="majorBidi" w:eastAsia="Times New Roman" w:hAnsiTheme="majorBidi" w:cstheme="majorBidi"/>
-          <w:lang w:eastAsia="en-GB" w:bidi="ar-SA"/>
-        </w:rPr>
-      </w:pPr>
-      <w:r>
-        <w:rPr>
-          <w:rFonts w:asciiTheme="majorBidi" w:hAnsiTheme="majorBidi" w:cstheme="majorBidi"/>
-        </w:rPr>
-        <w:t>IPOS</w:t>
-      </w:r>
-      <w:r>
-        <w:rPr>
-          <w:rFonts w:asciiTheme="majorBidi" w:hAnsiTheme="majorBidi" w:cstheme="majorBidi"/>
-          <w:color w:val="000000"/>
-          <w:sz w:val="13"/>
-          <w:szCs w:val="13"/>
-          <w:lang w:eastAsia="en-GB" w:bidi="ar-SA"/>
-        </w:rPr>
-        <w:t xml:space="preserve"> </w:t>
-      </w:r>
-      <w:r>
-        <w:rPr>
-          <w:rFonts w:asciiTheme="majorBidi" w:hAnsiTheme="majorBidi" w:cstheme="majorBidi"/>
-        </w:rPr>
-        <w:t>– PU</w:t>
-      </w:r>
-      <w:r>
-        <w:rPr>
-          <w:rFonts w:asciiTheme="majorBidi" w:hAnsiTheme="majorBidi" w:cstheme="majorBidi"/>
-          <w:color w:val="000000"/>
-          <w:sz w:val="13"/>
-          <w:szCs w:val="13"/>
-          <w:lang w:eastAsia="en-GB" w:bidi="ar-SA"/>
-        </w:rPr>
-        <w:t xml:space="preserve"> </w:t>
-      </w:r>
-      <w:r>
-        <w:rPr>
-          <w:rFonts w:asciiTheme="majorBidi" w:hAnsiTheme="majorBidi" w:cstheme="majorBidi"/>
-        </w:rPr>
-        <w:t xml:space="preserve">–MEMBERS: </w:t>
-      </w:r>
-      <w:r>
-        <w:rPr>
-          <w:rFonts w:asciiTheme="majorBidi" w:eastAsia="Times New Roman" w:hAnsiTheme="majorBidi" w:cstheme="majorBidi"/>
-          <w:lang w:eastAsia="en-GB" w:bidi="ar-SA"/>
-        </w:rPr>
-        <w:t>Handles user registration for commercial and non-commercial customers including account creation and login.</w:t>
-      </w:r>
-    </w:p>
-    <w:p>
-      <w:pPr>
-        <w:pStyle w:val="Textbody"/>
-        <w:numPr>
-          <w:ilvl w:val="0"/>
-          <w:numId w:val="2"/>
-        </w:numPr>
-        <w:spacing w:after="0"/>
-        <w:rPr>
-          <w:rFonts w:asciiTheme="majorBidi" w:hAnsiTheme="majorBidi" w:cstheme="majorBidi"/>
-        </w:rPr>
-      </w:pPr>
-      <w:r>
-        <w:rPr>
-          <w:rFonts w:asciiTheme="majorBidi" w:hAnsiTheme="majorBidi" w:cstheme="majorBidi"/>
-        </w:rPr>
-        <w:t>IPOS</w:t>
-      </w:r>
-      <w:r>
-        <w:rPr>
-          <w:rFonts w:asciiTheme="majorBidi" w:hAnsiTheme="majorBidi" w:cstheme="majorBidi"/>
-          <w:color w:val="000000"/>
-          <w:sz w:val="13"/>
-          <w:szCs w:val="13"/>
-          <w:lang w:eastAsia="en-GB" w:bidi="ar-SA"/>
-        </w:rPr>
-        <w:t xml:space="preserve"> </w:t>
-      </w:r>
-      <w:r>
-        <w:rPr>
-          <w:rFonts w:asciiTheme="majorBidi" w:hAnsiTheme="majorBidi" w:cstheme="majorBidi"/>
-        </w:rPr>
-        <w:t>– PU</w:t>
-      </w:r>
-      <w:r>
-        <w:rPr>
-          <w:rFonts w:asciiTheme="majorBidi" w:hAnsiTheme="majorBidi" w:cstheme="majorBidi"/>
-          <w:color w:val="000000"/>
-          <w:sz w:val="13"/>
-          <w:szCs w:val="13"/>
-          <w:lang w:eastAsia="en-GB" w:bidi="ar-SA"/>
-        </w:rPr>
-        <w:t xml:space="preserve"> </w:t>
-      </w:r>
-      <w:r>
-        <w:rPr>
-          <w:rFonts w:asciiTheme="majorBidi" w:hAnsiTheme="majorBidi" w:cstheme="majorBidi"/>
-        </w:rPr>
-        <w:t>– SALES: Allows users to browse products, add items to a cart, and complete purchases. Orders are forwarded to IPOS-CA to update stock.</w:t>
-      </w:r>
-    </w:p>
-    <w:p>
-      <w:pPr>
-        <w:pStyle w:val="Textbody"/>
-        <w:numPr>
-          <w:ilvl w:val="0"/>
-          <w:numId w:val="2"/>
-        </w:numPr>
-        <w:spacing w:after="0"/>
-        <w:rPr>
-          <w:rFonts w:asciiTheme="majorBidi" w:hAnsiTheme="majorBidi" w:cstheme="majorBidi"/>
-        </w:rPr>
-      </w:pPr>
-      <w:r>
-        <w:rPr>
-          <w:rFonts w:asciiTheme="majorBidi" w:hAnsiTheme="majorBidi" w:cstheme="majorBidi"/>
-        </w:rPr>
-        <w:t>IPOS</w:t>
-      </w:r>
-      <w:r>
-        <w:rPr>
-          <w:rFonts w:asciiTheme="majorBidi" w:hAnsiTheme="majorBidi" w:cstheme="majorBidi"/>
-          <w:color w:val="000000"/>
-          <w:sz w:val="13"/>
-          <w:szCs w:val="13"/>
-          <w:lang w:eastAsia="en-GB" w:bidi="ar-SA"/>
-        </w:rPr>
-        <w:t xml:space="preserve"> </w:t>
-      </w:r>
-      <w:r>
-        <w:rPr>
-          <w:rFonts w:asciiTheme="majorBidi" w:hAnsiTheme="majorBidi" w:cstheme="majorBidi"/>
-        </w:rPr>
-        <w:t>– PU</w:t>
-      </w:r>
-      <w:r>
-        <w:rPr>
-          <w:rFonts w:asciiTheme="majorBidi" w:hAnsiTheme="majorBidi" w:cstheme="majorBidi"/>
-          <w:color w:val="000000"/>
-          <w:sz w:val="13"/>
-          <w:szCs w:val="13"/>
-          <w:lang w:eastAsia="en-GB" w:bidi="ar-SA"/>
-        </w:rPr>
-        <w:t xml:space="preserve"> </w:t>
-      </w:r>
-      <w:r>
-        <w:rPr>
-          <w:rFonts w:asciiTheme="majorBidi" w:hAnsiTheme="majorBidi" w:cstheme="majorBidi"/>
-        </w:rPr>
-        <w:t>– COMMS: Manages communication with external services such as email notifications and payment processing.</w:t>
-      </w:r>
-    </w:p>
-    <w:p>
-      <w:pPr>
-        <w:pStyle w:val="Textbody"/>
-        <w:numPr>
-          <w:ilvl w:val="0"/>
-          <w:numId w:val="2"/>
-        </w:numPr>
-        <w:spacing w:after="0"/>
-        <w:rPr>
-          <w:rFonts w:asciiTheme="majorBidi" w:hAnsiTheme="majorBidi" w:cstheme="majorBidi"/>
-        </w:rPr>
-      </w:pPr>
-      <w:r>
-        <w:rPr>
-          <w:rFonts w:asciiTheme="majorBidi" w:hAnsiTheme="majorBidi" w:cstheme="majorBidi"/>
-        </w:rPr>
-        <w:t>IPOS</w:t>
-      </w:r>
-      <w:r>
-        <w:rPr>
-          <w:rFonts w:asciiTheme="majorBidi" w:hAnsiTheme="majorBidi" w:cstheme="majorBidi"/>
-          <w:color w:val="000000"/>
-          <w:sz w:val="13"/>
-          <w:szCs w:val="13"/>
-          <w:lang w:eastAsia="en-GB" w:bidi="ar-SA"/>
-        </w:rPr>
-        <w:t xml:space="preserve"> </w:t>
-      </w:r>
-      <w:r>
-        <w:rPr>
-          <w:rFonts w:asciiTheme="majorBidi" w:hAnsiTheme="majorBidi" w:cstheme="majorBidi"/>
-        </w:rPr>
-        <w:t>– PU</w:t>
-      </w:r>
-      <w:r>
-        <w:rPr>
-          <w:rFonts w:asciiTheme="majorBidi" w:hAnsiTheme="majorBidi" w:cstheme="majorBidi"/>
-          <w:color w:val="000000"/>
-          <w:sz w:val="13"/>
-          <w:szCs w:val="13"/>
-          <w:lang w:eastAsia="en-GB" w:bidi="ar-SA"/>
-        </w:rPr>
-        <w:t xml:space="preserve"> </w:t>
-      </w:r>
-      <w:r>
-        <w:rPr>
-          <w:rFonts w:asciiTheme="majorBidi" w:hAnsiTheme="majorBidi" w:cstheme="majorBidi"/>
-        </w:rPr>
-        <w:t>– PRM: Supports creation and management of promotional campaigns including tracking user interactions.</w:t>
-      </w:r>
-    </w:p>
-    <w:p>
-      <w:pPr>
-        <w:pStyle w:val="Textbody"/>
-        <w:numPr>
-          <w:ilvl w:val="0"/>
-          <w:numId w:val="2"/>
-        </w:numPr>
-        <w:rPr>
-          <w:rFonts w:asciiTheme="majorBidi" w:hAnsiTheme="majorBidi" w:cstheme="majorBidi"/>
-        </w:rPr>
-      </w:pPr>
-      <w:r>
-        <w:rPr>
-          <w:rFonts w:asciiTheme="majorBidi" w:hAnsiTheme="majorBidi" w:cstheme="majorBidi"/>
-        </w:rPr>
-        <w:t>IPOS</w:t>
-      </w:r>
-      <w:r>
-        <w:rPr>
-          <w:rFonts w:asciiTheme="majorBidi" w:hAnsiTheme="majorBidi" w:cstheme="majorBidi"/>
-          <w:color w:val="000000"/>
-          <w:sz w:val="13"/>
-          <w:szCs w:val="13"/>
-          <w:lang w:eastAsia="en-GB" w:bidi="ar-SA"/>
-        </w:rPr>
-        <w:t xml:space="preserve"> </w:t>
-      </w:r>
-      <w:r>
-        <w:rPr>
-          <w:rFonts w:asciiTheme="majorBidi" w:hAnsiTheme="majorBidi" w:cstheme="majorBidi"/>
-        </w:rPr>
-        <w:t>– PU</w:t>
-      </w:r>
-      <w:r>
-        <w:rPr>
-          <w:rFonts w:asciiTheme="majorBidi" w:hAnsiTheme="majorBidi" w:cstheme="majorBidi"/>
-          <w:color w:val="000000"/>
-          <w:sz w:val="13"/>
-          <w:szCs w:val="13"/>
-          <w:lang w:eastAsia="en-GB" w:bidi="ar-SA"/>
-        </w:rPr>
-        <w:t xml:space="preserve"> </w:t>
-      </w:r>
-      <w:r>
-        <w:rPr>
-          <w:rFonts w:asciiTheme="majorBidi" w:hAnsiTheme="majorBidi" w:cstheme="majorBidi"/>
-        </w:rPr>
-        <w:t>– RPT: Generates reports such as sales data, promotion performance, and campaign activity.</w:t>
-      </w:r>
-    </w:p>
-    <w:p>
-      <w:pPr>
-        <w:pStyle w:val="Heading1"/>
-        <w:rPr>
-          <w:rFonts w:asciiTheme="majorBidi" w:hAnsiTheme="majorBidi"/>
-        </w:rPr>
-      </w:pPr>
-      <w:bookmarkStart w:id="6" w:name="_Toc226910854"/>
       <w:r>
         <w:rPr>
           <w:rFonts w:asciiTheme="majorBidi" w:hAnsiTheme="majorBidi"/>
@@ -2795,40 +2221,40 @@
         <w:tab/>
         <w:t>Software Compilation and Project Structure</w:t>
       </w:r>
+      <w:bookmarkEnd w:id="5"/>
+    </w:p>
+    <w:p>
+      <w:pPr>
+        <w:pStyle w:val="Heading2"/>
+        <w:rPr>
+          <w:rFonts w:asciiTheme="majorBidi" w:hAnsiTheme="majorBidi"/>
+        </w:rPr>
+      </w:pPr>
+      <w:bookmarkStart w:id="6" w:name="_Toc227940239"/>
+      <w:r>
+        <w:rPr>
+          <w:rFonts w:asciiTheme="majorBidi" w:hAnsiTheme="majorBidi"/>
+        </w:rPr>
+        <w:t xml:space="preserve">2.1   </w:t>
+      </w:r>
+      <w:r>
+        <w:rPr>
+          <w:rFonts w:asciiTheme="majorBidi" w:hAnsiTheme="majorBidi"/>
+        </w:rPr>
+        <w:t xml:space="preserve">Software </w:t>
+      </w:r>
+      <w:r>
+        <w:rPr>
+          <w:rFonts w:asciiTheme="majorBidi" w:hAnsiTheme="majorBidi"/>
+        </w:rPr>
+        <w:t>Compilation</w:t>
+      </w:r>
       <w:bookmarkEnd w:id="6"/>
     </w:p>
     <w:p>
       <w:pPr>
-        <w:pStyle w:val="Heading2"/>
-        <w:rPr>
-          <w:rFonts w:asciiTheme="majorBidi" w:hAnsiTheme="majorBidi"/>
-        </w:rPr>
-      </w:pPr>
-      <w:bookmarkStart w:id="7" w:name="_Toc226910855"/>
-      <w:r>
-        <w:rPr>
-          <w:rFonts w:asciiTheme="majorBidi" w:hAnsiTheme="majorBidi"/>
-        </w:rPr>
-        <w:t xml:space="preserve">2.1   </w:t>
-      </w:r>
-      <w:r>
-        <w:rPr>
-          <w:rFonts w:asciiTheme="majorBidi" w:hAnsiTheme="majorBidi"/>
-        </w:rPr>
-        <w:t xml:space="preserve">Software </w:t>
-      </w:r>
-      <w:r>
-        <w:rPr>
-          <w:rFonts w:asciiTheme="majorBidi" w:hAnsiTheme="majorBidi"/>
-        </w:rPr>
-        <w:t>Compilation</w:t>
-      </w:r>
-      <w:bookmarkEnd w:id="7"/>
-    </w:p>
-    <w:p>
-      <w:pPr>
         <w:pStyle w:val="Textbody"/>
-        <w:spacing w:after="0"/>
+        <w:spacing w:before="240"/>
         <w:rPr>
           <w:rFonts w:asciiTheme="majorBidi" w:hAnsiTheme="majorBidi" w:cstheme="majorBidi"/>
           <w:b/>
@@ -3295,7 +2721,6 @@
               <w:rPr>
                 <w:rFonts w:asciiTheme="majorBidi" w:hAnsiTheme="majorBidi" w:cstheme="majorBidi"/>
               </w:rPr>
-              <w:lastRenderedPageBreak/>
               <w:t>Javalin</w:t>
             </w:r>
           </w:p>
@@ -3401,7 +2826,6 @@
     <w:p>
       <w:pPr>
         <w:pStyle w:val="Textbody"/>
-        <w:spacing w:after="0"/>
         <w:rPr>
           <w:rFonts w:asciiTheme="majorBidi" w:hAnsiTheme="majorBidi" w:cstheme="majorBidi"/>
           <w:b/>
@@ -3462,6 +2886,7 @@
         <w:rPr>
           <w:rFonts w:asciiTheme="majorBidi" w:hAnsiTheme="majorBidi" w:cstheme="majorBidi"/>
         </w:rPr>
+        <w:lastRenderedPageBreak/>
         <w:t>The system relies on several external libraries to support its functionality, including:</w:t>
       </w:r>
     </w:p>
@@ -3589,13 +3014,14 @@
     </w:p>
     <w:p>
       <w:pPr>
-        <w:pStyle w:val="Heading3"/>
+        <w:rPr>
+          <w:rFonts w:asciiTheme="majorBidi" w:hAnsiTheme="majorBidi" w:cstheme="majorBidi"/>
+        </w:rPr>
       </w:pPr>
       <w:r>
         <w:rPr>
           <w:rStyle w:val="Strong"/>
-          <w:b/>
-          <w:bCs/>
+          <w:rFonts w:asciiTheme="majorBidi" w:hAnsiTheme="majorBidi" w:cstheme="majorBidi"/>
         </w:rPr>
         <w:t>JavaFX Configuration</w:t>
       </w:r>
@@ -3603,7 +3029,7 @@
     <w:p>
       <w:pPr>
         <w:pStyle w:val="NormalWeb"/>
-        <w:spacing w:after="0" w:afterAutospacing="0"/>
+        <w:spacing w:after="240" w:afterAutospacing="0"/>
         <w:rPr>
           <w:sz w:val="22"/>
           <w:szCs w:val="22"/>
@@ -3614,14 +3040,20 @@
           <w:sz w:val="22"/>
           <w:szCs w:val="22"/>
         </w:rPr>
-        <w:t xml:space="preserve">JavaFX is managed through Gradle using the OpenJFX plugin. The required libraries (version 21) are automatically downloaded and configured when the project is opened and synced in IntelliJ IDEA. The system uses the </w:t>
+        <w:t xml:space="preserve">JavaFX is managed through Gradle using the OpenJFX plugin. The required libraries (version 21) are automatically downloaded and configured when the project is opened and synced in IntelliJ IDEA. The system uses </w:t>
+      </w:r>
+      <w:r>
+        <w:rPr>
+          <w:sz w:val="22"/>
+          <w:szCs w:val="22"/>
+        </w:rPr>
+        <w:t xml:space="preserve">the </w:t>
       </w:r>
       <w:r>
         <w:rPr>
           <w:rFonts w:ascii="Consolas" w:hAnsi="Consolas" w:cs="Consolas"/>
           <w:sz w:val="22"/>
           <w:szCs w:val="22"/>
-          <w:u w:val="single"/>
         </w:rPr>
         <w:t>javafx.controls</w:t>
       </w:r>
@@ -3637,7 +3069,6 @@
           <w:rFonts w:ascii="Consolas" w:hAnsi="Consolas" w:cs="Consolas"/>
           <w:sz w:val="22"/>
           <w:szCs w:val="22"/>
-          <w:u w:val="single"/>
         </w:rPr>
         <w:t>javafx.fxml</w:t>
       </w:r>
@@ -3651,22 +3082,20 @@
     </w:p>
     <w:p>
       <w:pPr>
-        <w:pStyle w:val="NormalWeb"/>
-        <w:spacing w:after="0" w:afterAutospacing="0"/>
-        <w:rPr>
-          <w:sz w:val="22"/>
-          <w:szCs w:val="22"/>
-        </w:rPr>
-      </w:pPr>
-      <w:r>
         <w:rPr>
           <w:rFonts w:asciiTheme="majorBidi" w:hAnsiTheme="majorBidi" w:cstheme="majorBidi"/>
           <w:b/>
           <w:bCs/>
         </w:rPr>
+      </w:pPr>
+      <w:r>
+        <w:rPr>
+          <w:rFonts w:asciiTheme="majorBidi" w:hAnsiTheme="majorBidi" w:cstheme="majorBidi"/>
+          <w:b/>
+          <w:bCs/>
+        </w:rPr>
         <w:t>Compilation and Execution Instructions</w:t>
       </w:r>
-      <w:bookmarkStart w:id="8" w:name="_Toc226910856"/>
     </w:p>
     <w:p>
       <w:pPr>
@@ -3848,24 +3277,39 @@
           <w:sz w:val="22"/>
           <w:szCs w:val="22"/>
         </w:rPr>
-        <w:t>Ensure port 8090 is available before running the system.</w:t>
+        <w:t xml:space="preserve">Ensure </w:t>
+      </w:r>
+      <w:r>
+        <w:rPr>
+          <w:sz w:val="22"/>
+          <w:szCs w:val="22"/>
+        </w:rPr>
+        <w:t xml:space="preserve">that </w:t>
+      </w:r>
+      <w:r>
+        <w:rPr>
+          <w:sz w:val="22"/>
+          <w:szCs w:val="22"/>
+        </w:rPr>
+        <w:t>port 8090 is available before running the system.</w:t>
       </w:r>
     </w:p>
     <w:p>
       <w:pPr>
         <w:pStyle w:val="Heading2"/>
+        <w:spacing w:after="240"/>
         <w:rPr>
           <w:rFonts w:asciiTheme="majorBidi" w:hAnsiTheme="majorBidi"/>
         </w:rPr>
       </w:pPr>
+      <w:bookmarkStart w:id="7" w:name="_Toc227940240"/>
       <w:r>
         <w:rPr>
           <w:rFonts w:asciiTheme="majorBidi" w:hAnsiTheme="majorBidi"/>
         </w:rPr>
-        <w:lastRenderedPageBreak/>
         <w:t>2.2   Project Structure</w:t>
       </w:r>
-      <w:bookmarkEnd w:id="8"/>
+      <w:bookmarkEnd w:id="7"/>
     </w:p>
     <w:p>
       <w:pPr>
@@ -3878,37 +3322,7 @@
         <w:rPr>
           <w:rFonts w:asciiTheme="majorBidi" w:hAnsiTheme="majorBidi" w:cstheme="majorBidi"/>
         </w:rPr>
-        <w:t xml:space="preserve">Explain how the project is organised into packages </w:t>
-      </w:r>
-      <w:r>
-        <w:rPr>
-          <w:rFonts w:asciiTheme="majorBidi" w:hAnsiTheme="majorBidi" w:cstheme="majorBidi"/>
-        </w:rPr>
-        <w:t>and m</w:t>
-      </w:r>
-      <w:r>
-        <w:rPr>
-          <w:rFonts w:asciiTheme="majorBidi" w:hAnsiTheme="majorBidi" w:cstheme="majorBidi"/>
-        </w:rPr>
-        <w:t>ention the use of controllers</w:t>
-      </w:r>
-      <w:r>
-        <w:rPr>
-          <w:rFonts w:asciiTheme="majorBidi" w:hAnsiTheme="majorBidi" w:cstheme="majorBidi"/>
-        </w:rPr>
-        <w:t xml:space="preserve"> </w:t>
-      </w:r>
-      <w:r>
-        <w:rPr>
-          <w:rFonts w:asciiTheme="majorBidi" w:hAnsiTheme="majorBidi" w:cstheme="majorBidi"/>
-        </w:rPr>
-        <w:t>and database components</w:t>
-      </w:r>
-      <w:r>
-        <w:rPr>
-          <w:rFonts w:asciiTheme="majorBidi" w:hAnsiTheme="majorBidi" w:cstheme="majorBidi"/>
-        </w:rPr>
-        <w:t xml:space="preserve"> and keep it focused on structure.</w:t>
+        <w:t>The system is organised into packages based on functionality. Each package contains related classes responsible for a specific part of the subsystem.</w:t>
       </w:r>
     </w:p>
     <w:tbl>
@@ -4044,7 +3458,7 @@
               <w:rPr>
                 <w:rFonts w:asciiTheme="majorBidi" w:hAnsiTheme="majorBidi" w:cstheme="majorBidi"/>
               </w:rPr>
-              <w:t>IPOS–PU–MEMBERS</w:t>
+              <w:t>members</w:t>
             </w:r>
           </w:p>
         </w:tc>
@@ -4063,10 +3477,14 @@
             <w:pPr>
               <w:rPr>
                 <w:rFonts w:asciiTheme="majorBidi" w:eastAsia="Arial" w:hAnsiTheme="majorBidi" w:cstheme="majorBidi"/>
-                <w:b/>
-                <w:bCs/>
               </w:rPr>
             </w:pPr>
+            <w:r>
+              <w:rPr>
+                <w:rFonts w:asciiTheme="majorBidi" w:eastAsia="Arial" w:hAnsiTheme="majorBidi" w:cstheme="majorBidi"/>
+              </w:rPr>
+              <w:t>UserDatabase, UserType</w:t>
+            </w:r>
           </w:p>
         </w:tc>
         <w:tc>
@@ -4084,10 +3502,14 @@
             <w:pPr>
               <w:rPr>
                 <w:rFonts w:asciiTheme="majorBidi" w:eastAsia="Arial" w:hAnsiTheme="majorBidi" w:cstheme="majorBidi"/>
-                <w:b/>
-                <w:bCs/>
               </w:rPr>
             </w:pPr>
+            <w:r>
+              <w:rPr>
+                <w:rFonts w:asciiTheme="majorBidi" w:eastAsia="Arial" w:hAnsiTheme="majorBidi" w:cstheme="majorBidi"/>
+              </w:rPr>
+              <w:t>Handles user account data and user type definitions</w:t>
+            </w:r>
           </w:p>
         </w:tc>
       </w:tr>
@@ -4115,39 +3537,7 @@
               <w:rPr>
                 <w:rFonts w:asciiTheme="majorBidi" w:hAnsiTheme="majorBidi" w:cstheme="majorBidi"/>
               </w:rPr>
-              <w:t>IPOS</w:t>
-            </w:r>
-            <w:r>
-              <w:rPr>
-                <w:rFonts w:asciiTheme="majorBidi" w:hAnsiTheme="majorBidi" w:cstheme="majorBidi"/>
-                <w:color w:val="000000"/>
-                <w:sz w:val="13"/>
-                <w:szCs w:val="13"/>
-                <w:lang w:eastAsia="en-GB" w:bidi="ar-SA"/>
-              </w:rPr>
-              <w:t xml:space="preserve"> </w:t>
-            </w:r>
-            <w:r>
-              <w:rPr>
-                <w:rFonts w:asciiTheme="majorBidi" w:hAnsiTheme="majorBidi" w:cstheme="majorBidi"/>
-              </w:rPr>
-              <w:t>– PU</w:t>
-            </w:r>
-            <w:r>
-              <w:rPr>
-                <w:rFonts w:asciiTheme="majorBidi" w:hAnsiTheme="majorBidi" w:cstheme="majorBidi"/>
-                <w:color w:val="000000"/>
-                <w:sz w:val="13"/>
-                <w:szCs w:val="13"/>
-                <w:lang w:eastAsia="en-GB" w:bidi="ar-SA"/>
-              </w:rPr>
-              <w:t xml:space="preserve"> </w:t>
-            </w:r>
-            <w:r>
-              <w:rPr>
-                <w:rFonts w:asciiTheme="majorBidi" w:hAnsiTheme="majorBidi" w:cstheme="majorBidi"/>
-              </w:rPr>
-              <w:t>– SALES</w:t>
+              <w:t>sales</w:t>
             </w:r>
           </w:p>
         </w:tc>
@@ -4166,10 +3556,14 @@
             <w:pPr>
               <w:rPr>
                 <w:rFonts w:asciiTheme="majorBidi" w:eastAsia="Arial" w:hAnsiTheme="majorBidi" w:cstheme="majorBidi"/>
-                <w:b/>
-                <w:bCs/>
               </w:rPr>
             </w:pPr>
+            <w:r>
+              <w:rPr>
+                <w:rFonts w:asciiTheme="majorBidi" w:eastAsia="Arial" w:hAnsiTheme="majorBidi" w:cstheme="majorBidi"/>
+              </w:rPr>
+              <w:t>Cart, CartItem, Merchant, Product, ProductFeed</w:t>
+            </w:r>
           </w:p>
         </w:tc>
         <w:tc>
@@ -4187,10 +3581,14 @@
             <w:pPr>
               <w:rPr>
                 <w:rFonts w:asciiTheme="majorBidi" w:eastAsia="Arial" w:hAnsiTheme="majorBidi" w:cstheme="majorBidi"/>
-                <w:b/>
-                <w:bCs/>
               </w:rPr>
             </w:pPr>
+            <w:r>
+              <w:rPr>
+                <w:rFonts w:asciiTheme="majorBidi" w:eastAsia="Arial" w:hAnsiTheme="majorBidi" w:cstheme="majorBidi"/>
+              </w:rPr>
+              <w:t>Manages products, merchants, and shopping cart functionality</w:t>
+            </w:r>
           </w:p>
         </w:tc>
       </w:tr>
@@ -4218,39 +3616,8 @@
               <w:rPr>
                 <w:rFonts w:asciiTheme="majorBidi" w:hAnsiTheme="majorBidi" w:cstheme="majorBidi"/>
               </w:rPr>
-              <w:t>IPOS</w:t>
-            </w:r>
-            <w:r>
-              <w:rPr>
-                <w:rFonts w:asciiTheme="majorBidi" w:hAnsiTheme="majorBidi" w:cstheme="majorBidi"/>
-                <w:color w:val="000000"/>
-                <w:sz w:val="13"/>
-                <w:szCs w:val="13"/>
-                <w:lang w:eastAsia="en-GB" w:bidi="ar-SA"/>
-              </w:rPr>
-              <w:t xml:space="preserve"> </w:t>
-            </w:r>
-            <w:r>
-              <w:rPr>
-                <w:rFonts w:asciiTheme="majorBidi" w:hAnsiTheme="majorBidi" w:cstheme="majorBidi"/>
-              </w:rPr>
-              <w:t>– PU</w:t>
-            </w:r>
-            <w:r>
-              <w:rPr>
-                <w:rFonts w:asciiTheme="majorBidi" w:hAnsiTheme="majorBidi" w:cstheme="majorBidi"/>
-                <w:color w:val="000000"/>
-                <w:sz w:val="13"/>
-                <w:szCs w:val="13"/>
-                <w:lang w:eastAsia="en-GB" w:bidi="ar-SA"/>
-              </w:rPr>
-              <w:t xml:space="preserve"> </w:t>
-            </w:r>
-            <w:r>
-              <w:rPr>
-                <w:rFonts w:asciiTheme="majorBidi" w:hAnsiTheme="majorBidi" w:cstheme="majorBidi"/>
-              </w:rPr>
-              <w:t>– COMMS</w:t>
+              <w:lastRenderedPageBreak/>
+              <w:t>comms</w:t>
             </w:r>
           </w:p>
         </w:tc>
@@ -4269,10 +3636,26 @@
             <w:pPr>
               <w:rPr>
                 <w:rFonts w:asciiTheme="majorBidi" w:eastAsia="Arial" w:hAnsiTheme="majorBidi" w:cstheme="majorBidi"/>
-                <w:b/>
-                <w:bCs/>
               </w:rPr>
             </w:pPr>
+            <w:r>
+              <w:rPr>
+                <w:rFonts w:asciiTheme="majorBidi" w:eastAsia="Arial" w:hAnsiTheme="majorBidi" w:cstheme="majorBidi"/>
+              </w:rPr>
+              <w:t>CAClient, SAClient,</w:t>
+            </w:r>
+            <w:r>
+              <w:rPr>
+                <w:rFonts w:asciiTheme="majorBidi" w:eastAsia="Arial" w:hAnsiTheme="majorBidi" w:cstheme="majorBidi"/>
+              </w:rPr>
+              <w:t xml:space="preserve"> Mail, MutateStockRequest, Payment, Response, StockItem, </w:t>
+            </w:r>
+            <w:r>
+              <w:rPr>
+                <w:rFonts w:asciiTheme="majorBidi" w:eastAsia="Arial" w:hAnsiTheme="majorBidi" w:cstheme="majorBidi"/>
+              </w:rPr>
+              <w:t xml:space="preserve"> MailService, OrderService, PaymentService, RestServer</w:t>
+            </w:r>
           </w:p>
         </w:tc>
         <w:tc>
@@ -4290,10 +3673,14 @@
             <w:pPr>
               <w:rPr>
                 <w:rFonts w:asciiTheme="majorBidi" w:eastAsia="Arial" w:hAnsiTheme="majorBidi" w:cstheme="majorBidi"/>
-                <w:b/>
-                <w:bCs/>
               </w:rPr>
             </w:pPr>
+            <w:r>
+              <w:rPr>
+                <w:rFonts w:asciiTheme="majorBidi" w:eastAsia="Arial" w:hAnsiTheme="majorBidi" w:cstheme="majorBidi"/>
+              </w:rPr>
+              <w:t>Handles communication with external subsystems, email, payments, and backend API services</w:t>
+            </w:r>
           </w:p>
         </w:tc>
       </w:tr>
@@ -4321,39 +3708,7 @@
               <w:rPr>
                 <w:rFonts w:asciiTheme="majorBidi" w:hAnsiTheme="majorBidi" w:cstheme="majorBidi"/>
               </w:rPr>
-              <w:t>IPOS</w:t>
-            </w:r>
-            <w:r>
-              <w:rPr>
-                <w:rFonts w:asciiTheme="majorBidi" w:hAnsiTheme="majorBidi" w:cstheme="majorBidi"/>
-                <w:color w:val="000000"/>
-                <w:sz w:val="13"/>
-                <w:szCs w:val="13"/>
-                <w:lang w:eastAsia="en-GB" w:bidi="ar-SA"/>
-              </w:rPr>
-              <w:t xml:space="preserve"> </w:t>
-            </w:r>
-            <w:r>
-              <w:rPr>
-                <w:rFonts w:asciiTheme="majorBidi" w:hAnsiTheme="majorBidi" w:cstheme="majorBidi"/>
-              </w:rPr>
-              <w:t>– PU</w:t>
-            </w:r>
-            <w:r>
-              <w:rPr>
-                <w:rFonts w:asciiTheme="majorBidi" w:hAnsiTheme="majorBidi" w:cstheme="majorBidi"/>
-                <w:color w:val="000000"/>
-                <w:sz w:val="13"/>
-                <w:szCs w:val="13"/>
-                <w:lang w:eastAsia="en-GB" w:bidi="ar-SA"/>
-              </w:rPr>
-              <w:t xml:space="preserve"> </w:t>
-            </w:r>
-            <w:r>
-              <w:rPr>
-                <w:rFonts w:asciiTheme="majorBidi" w:hAnsiTheme="majorBidi" w:cstheme="majorBidi"/>
-              </w:rPr>
-              <w:t>– PRM</w:t>
+              <w:t>prm</w:t>
             </w:r>
           </w:p>
         </w:tc>
@@ -4372,10 +3727,14 @@
             <w:pPr>
               <w:rPr>
                 <w:rFonts w:asciiTheme="majorBidi" w:eastAsia="Arial" w:hAnsiTheme="majorBidi" w:cstheme="majorBidi"/>
-                <w:b/>
-                <w:bCs/>
               </w:rPr>
             </w:pPr>
+            <w:r>
+              <w:rPr>
+                <w:rFonts w:asciiTheme="majorBidi" w:eastAsia="Arial" w:hAnsiTheme="majorBidi" w:cstheme="majorBidi"/>
+              </w:rPr>
+              <w:t>Promotion, PromotionDatabase</w:t>
+            </w:r>
           </w:p>
         </w:tc>
         <w:tc>
@@ -4393,10 +3752,14 @@
             <w:pPr>
               <w:rPr>
                 <w:rFonts w:asciiTheme="majorBidi" w:eastAsia="Arial" w:hAnsiTheme="majorBidi" w:cstheme="majorBidi"/>
-                <w:b/>
-                <w:bCs/>
               </w:rPr>
             </w:pPr>
+            <w:r>
+              <w:rPr>
+                <w:rFonts w:asciiTheme="majorBidi" w:eastAsia="Arial" w:hAnsiTheme="majorBidi" w:cstheme="majorBidi"/>
+              </w:rPr>
+              <w:t>Manages promotions and campaign data</w:t>
+            </w:r>
           </w:p>
         </w:tc>
       </w:tr>
@@ -4424,39 +3787,7 @@
               <w:rPr>
                 <w:rFonts w:asciiTheme="majorBidi" w:hAnsiTheme="majorBidi" w:cstheme="majorBidi"/>
               </w:rPr>
-              <w:t>IPOS</w:t>
-            </w:r>
-            <w:r>
-              <w:rPr>
-                <w:rFonts w:asciiTheme="majorBidi" w:hAnsiTheme="majorBidi" w:cstheme="majorBidi"/>
-                <w:color w:val="000000"/>
-                <w:sz w:val="13"/>
-                <w:szCs w:val="13"/>
-                <w:lang w:eastAsia="en-GB" w:bidi="ar-SA"/>
-              </w:rPr>
-              <w:t xml:space="preserve"> </w:t>
-            </w:r>
-            <w:r>
-              <w:rPr>
-                <w:rFonts w:asciiTheme="majorBidi" w:hAnsiTheme="majorBidi" w:cstheme="majorBidi"/>
-              </w:rPr>
-              <w:t>– PU</w:t>
-            </w:r>
-            <w:r>
-              <w:rPr>
-                <w:rFonts w:asciiTheme="majorBidi" w:hAnsiTheme="majorBidi" w:cstheme="majorBidi"/>
-                <w:color w:val="000000"/>
-                <w:sz w:val="13"/>
-                <w:szCs w:val="13"/>
-                <w:lang w:eastAsia="en-GB" w:bidi="ar-SA"/>
-              </w:rPr>
-              <w:t xml:space="preserve"> </w:t>
-            </w:r>
-            <w:r>
-              <w:rPr>
-                <w:rFonts w:asciiTheme="majorBidi" w:hAnsiTheme="majorBidi" w:cstheme="majorBidi"/>
-              </w:rPr>
-              <w:t>– RPT</w:t>
+              <w:t>rpt</w:t>
             </w:r>
           </w:p>
         </w:tc>
@@ -4475,10 +3806,14 @@
             <w:pPr>
               <w:rPr>
                 <w:rFonts w:asciiTheme="majorBidi" w:eastAsia="Arial" w:hAnsiTheme="majorBidi" w:cstheme="majorBidi"/>
-                <w:b/>
-                <w:bCs/>
               </w:rPr>
             </w:pPr>
+            <w:r>
+              <w:rPr>
+                <w:rFonts w:asciiTheme="majorBidi" w:eastAsia="Arial" w:hAnsiTheme="majorBidi" w:cstheme="majorBidi"/>
+              </w:rPr>
+              <w:t>PdfExporter, ReportRow, ReportService</w:t>
+            </w:r>
           </w:p>
         </w:tc>
         <w:tc>
@@ -4496,10 +3831,275 @@
             <w:pPr>
               <w:rPr>
                 <w:rFonts w:asciiTheme="majorBidi" w:eastAsia="Arial" w:hAnsiTheme="majorBidi" w:cstheme="majorBidi"/>
-                <w:b/>
-                <w:bCs/>
               </w:rPr>
             </w:pPr>
+            <w:r>
+              <w:rPr>
+                <w:rFonts w:asciiTheme="majorBidi" w:eastAsia="Arial" w:hAnsiTheme="majorBidi" w:cstheme="majorBidi"/>
+              </w:rPr>
+              <w:t>Generates reports and exports them as PDF files</w:t>
+            </w:r>
+          </w:p>
+        </w:tc>
+      </w:tr>
+      <w:tr>
+        <w:tc>
+          <w:tcPr>
+            <w:tcW w:w="1219" w:type="pct"/>
+            <w:shd w:val="clear" w:color="auto" w:fill="FFFFFF" w:themeFill="background1"/>
+            <w:tcMar>
+              <w:top w:w="80" w:type="dxa"/>
+              <w:left w:w="120" w:type="dxa"/>
+              <w:bottom w:w="80" w:type="dxa"/>
+              <w:right w:w="120" w:type="dxa"/>
+            </w:tcMar>
+          </w:tcPr>
+          <w:p>
+            <w:pPr>
+              <w:rPr>
+                <w:rFonts w:asciiTheme="majorBidi" w:hAnsiTheme="majorBidi" w:cstheme="majorBidi"/>
+              </w:rPr>
+            </w:pPr>
+            <w:r>
+              <w:rPr>
+                <w:rFonts w:asciiTheme="majorBidi" w:hAnsiTheme="majorBidi" w:cstheme="majorBidi"/>
+              </w:rPr>
+              <w:t>ord</w:t>
+            </w:r>
+          </w:p>
+        </w:tc>
+        <w:tc>
+          <w:tcPr>
+            <w:tcW w:w="1994" w:type="pct"/>
+            <w:shd w:val="clear" w:color="auto" w:fill="FFFFFF" w:themeFill="background1"/>
+            <w:tcMar>
+              <w:top w:w="80" w:type="dxa"/>
+              <w:left w:w="120" w:type="dxa"/>
+              <w:bottom w:w="80" w:type="dxa"/>
+              <w:right w:w="120" w:type="dxa"/>
+            </w:tcMar>
+          </w:tcPr>
+          <w:p>
+            <w:pPr>
+              <w:rPr>
+                <w:rFonts w:asciiTheme="majorBidi" w:eastAsia="Arial" w:hAnsiTheme="majorBidi" w:cstheme="majorBidi"/>
+              </w:rPr>
+            </w:pPr>
+            <w:r>
+              <w:rPr>
+                <w:rFonts w:asciiTheme="majorBidi" w:eastAsia="Arial" w:hAnsiTheme="majorBidi" w:cstheme="majorBidi"/>
+              </w:rPr>
+              <w:t>Order, OrderDatabase, OrderItem, OrderStatus</w:t>
+            </w:r>
+          </w:p>
+        </w:tc>
+        <w:tc>
+          <w:tcPr>
+            <w:tcW w:w="1787" w:type="pct"/>
+            <w:shd w:val="clear" w:color="auto" w:fill="FFFFFF" w:themeFill="background1"/>
+            <w:tcMar>
+              <w:top w:w="80" w:type="dxa"/>
+              <w:left w:w="120" w:type="dxa"/>
+              <w:bottom w:w="80" w:type="dxa"/>
+              <w:right w:w="120" w:type="dxa"/>
+            </w:tcMar>
+          </w:tcPr>
+          <w:p>
+            <w:pPr>
+              <w:rPr>
+                <w:rFonts w:asciiTheme="majorBidi" w:eastAsia="Arial" w:hAnsiTheme="majorBidi" w:cstheme="majorBidi"/>
+              </w:rPr>
+            </w:pPr>
+            <w:r>
+              <w:rPr>
+                <w:rFonts w:asciiTheme="majorBidi" w:eastAsia="Arial" w:hAnsiTheme="majorBidi" w:cstheme="majorBidi"/>
+              </w:rPr>
+              <w:t>Handles order storage, order items, and order status management</w:t>
+            </w:r>
+          </w:p>
+        </w:tc>
+      </w:tr>
+      <w:tr>
+        <w:tc>
+          <w:tcPr>
+            <w:tcW w:w="1219" w:type="pct"/>
+            <w:shd w:val="clear" w:color="auto" w:fill="FFFFFF" w:themeFill="background1"/>
+            <w:tcMar>
+              <w:top w:w="80" w:type="dxa"/>
+              <w:left w:w="120" w:type="dxa"/>
+              <w:bottom w:w="80" w:type="dxa"/>
+              <w:right w:w="120" w:type="dxa"/>
+            </w:tcMar>
+          </w:tcPr>
+          <w:p>
+            <w:pPr>
+              <w:rPr>
+                <w:rFonts w:asciiTheme="majorBidi" w:hAnsiTheme="majorBidi" w:cstheme="majorBidi"/>
+              </w:rPr>
+            </w:pPr>
+            <w:r>
+              <w:rPr>
+                <w:rFonts w:asciiTheme="majorBidi" w:hAnsiTheme="majorBidi" w:cstheme="majorBidi"/>
+              </w:rPr>
+              <w:t>data</w:t>
+            </w:r>
+          </w:p>
+        </w:tc>
+        <w:tc>
+          <w:tcPr>
+            <w:tcW w:w="1994" w:type="pct"/>
+            <w:shd w:val="clear" w:color="auto" w:fill="FFFFFF" w:themeFill="background1"/>
+            <w:tcMar>
+              <w:top w:w="80" w:type="dxa"/>
+              <w:left w:w="120" w:type="dxa"/>
+              <w:bottom w:w="80" w:type="dxa"/>
+              <w:right w:w="120" w:type="dxa"/>
+            </w:tcMar>
+          </w:tcPr>
+          <w:p>
+            <w:pPr>
+              <w:rPr>
+                <w:rFonts w:asciiTheme="majorBidi" w:eastAsia="Arial" w:hAnsiTheme="majorBidi" w:cstheme="majorBidi"/>
+              </w:rPr>
+            </w:pPr>
+            <w:r>
+              <w:rPr>
+                <w:rFonts w:asciiTheme="majorBidi" w:eastAsia="Arial" w:hAnsiTheme="majorBidi" w:cstheme="majorBidi"/>
+              </w:rPr>
+              <w:t>Database, DatabaseUtility, PaymentDatabase</w:t>
+            </w:r>
+          </w:p>
+        </w:tc>
+        <w:tc>
+          <w:tcPr>
+            <w:tcW w:w="1787" w:type="pct"/>
+            <w:shd w:val="clear" w:color="auto" w:fill="FFFFFF" w:themeFill="background1"/>
+            <w:tcMar>
+              <w:top w:w="80" w:type="dxa"/>
+              <w:left w:w="120" w:type="dxa"/>
+              <w:bottom w:w="80" w:type="dxa"/>
+              <w:right w:w="120" w:type="dxa"/>
+            </w:tcMar>
+          </w:tcPr>
+          <w:p>
+            <w:pPr>
+              <w:rPr>
+                <w:rFonts w:asciiTheme="majorBidi" w:eastAsia="Arial" w:hAnsiTheme="majorBidi" w:cstheme="majorBidi"/>
+              </w:rPr>
+            </w:pPr>
+            <w:r>
+              <w:rPr>
+                <w:rFonts w:asciiTheme="majorBidi" w:eastAsia="Arial" w:hAnsiTheme="majorBidi" w:cstheme="majorBidi"/>
+              </w:rPr>
+              <w:t>Manages database connections and shared data access operations</w:t>
+            </w:r>
+          </w:p>
+        </w:tc>
+      </w:tr>
+      <w:tr>
+        <w:tc>
+          <w:tcPr>
+            <w:tcW w:w="1219" w:type="pct"/>
+            <w:shd w:val="clear" w:color="auto" w:fill="FFFFFF" w:themeFill="background1"/>
+            <w:tcMar>
+              <w:top w:w="80" w:type="dxa"/>
+              <w:left w:w="120" w:type="dxa"/>
+              <w:bottom w:w="80" w:type="dxa"/>
+              <w:right w:w="120" w:type="dxa"/>
+            </w:tcMar>
+          </w:tcPr>
+          <w:p>
+            <w:pPr>
+              <w:rPr>
+                <w:rFonts w:asciiTheme="majorBidi" w:hAnsiTheme="majorBidi" w:cstheme="majorBidi"/>
+              </w:rPr>
+            </w:pPr>
+            <w:r>
+              <w:rPr>
+                <w:rFonts w:asciiTheme="majorBidi" w:hAnsiTheme="majorBidi" w:cstheme="majorBidi"/>
+              </w:rPr>
+              <w:t>gui</w:t>
+            </w:r>
+          </w:p>
+        </w:tc>
+        <w:tc>
+          <w:tcPr>
+            <w:tcW w:w="1994" w:type="pct"/>
+            <w:shd w:val="clear" w:color="auto" w:fill="FFFFFF" w:themeFill="background1"/>
+            <w:tcMar>
+              <w:top w:w="80" w:type="dxa"/>
+              <w:left w:w="120" w:type="dxa"/>
+              <w:bottom w:w="80" w:type="dxa"/>
+              <w:right w:w="120" w:type="dxa"/>
+            </w:tcMar>
+          </w:tcPr>
+          <w:p>
+            <w:pPr>
+              <w:rPr>
+                <w:rFonts w:asciiTheme="majorBidi" w:eastAsia="Arial" w:hAnsiTheme="majorBidi" w:cstheme="majorBidi"/>
+              </w:rPr>
+            </w:pPr>
+            <w:r>
+              <w:rPr>
+                <w:rFonts w:asciiTheme="majorBidi" w:eastAsia="Arial" w:hAnsiTheme="majorBidi" w:cstheme="majorBidi"/>
+              </w:rPr>
+              <w:t xml:space="preserve">AppView, SceneHelper, </w:t>
+            </w:r>
+            <w:r>
+              <w:rPr>
+                <w:rFonts w:asciiTheme="majorBidi" w:eastAsia="Arial" w:hAnsiTheme="majorBidi" w:cstheme="majorBidi"/>
+              </w:rPr>
+              <w:t xml:space="preserve">multiple controllers (e.g. LoginController, </w:t>
+            </w:r>
+            <w:r>
+              <w:rPr>
+                <w:rFonts w:asciiTheme="majorBidi" w:eastAsia="Arial" w:hAnsiTheme="majorBidi" w:cstheme="majorBidi"/>
+              </w:rPr>
+              <w:t>Promotions</w:t>
+            </w:r>
+            <w:r>
+              <w:rPr>
+                <w:rFonts w:asciiTheme="majorBidi" w:eastAsia="Arial" w:hAnsiTheme="majorBidi" w:cstheme="majorBidi"/>
+              </w:rPr>
+              <w:t>Controller, HomeController</w:t>
+            </w:r>
+            <w:r>
+              <w:rPr>
+                <w:rFonts w:asciiTheme="majorBidi" w:eastAsia="Arial" w:hAnsiTheme="majorBidi" w:cstheme="majorBidi"/>
+              </w:rPr>
+              <w:t>, ReportsController</w:t>
+            </w:r>
+            <w:r>
+              <w:rPr>
+                <w:rFonts w:asciiTheme="majorBidi" w:eastAsia="Arial" w:hAnsiTheme="majorBidi" w:cstheme="majorBidi"/>
+              </w:rPr>
+              <w:t>)</w:t>
+            </w:r>
+          </w:p>
+        </w:tc>
+        <w:tc>
+          <w:tcPr>
+            <w:tcW w:w="1787" w:type="pct"/>
+            <w:shd w:val="clear" w:color="auto" w:fill="FFFFFF" w:themeFill="background1"/>
+            <w:tcMar>
+              <w:top w:w="80" w:type="dxa"/>
+              <w:left w:w="120" w:type="dxa"/>
+              <w:bottom w:w="80" w:type="dxa"/>
+              <w:right w:w="120" w:type="dxa"/>
+            </w:tcMar>
+          </w:tcPr>
+          <w:p>
+            <w:pPr>
+              <w:rPr>
+                <w:rFonts w:asciiTheme="majorBidi" w:eastAsia="Arial" w:hAnsiTheme="majorBidi" w:cstheme="majorBidi"/>
+              </w:rPr>
+            </w:pPr>
+            <w:r>
+              <w:rPr>
+                <w:rFonts w:asciiTheme="majorBidi" w:eastAsia="Arial" w:hAnsiTheme="majorBidi" w:cstheme="majorBidi"/>
+              </w:rPr>
+              <w:t>Handles user interface logic and screen navigation</w:t>
+            </w:r>
           </w:p>
         </w:tc>
       </w:tr>
@@ -4509,36 +4109,361 @@
         <w:spacing w:before="200" w:after="80"/>
         <w:rPr>
           <w:rFonts w:asciiTheme="majorBidi" w:eastAsia="Arial" w:hAnsiTheme="majorBidi" w:cstheme="majorBidi"/>
-          <w:b/>
-          <w:bCs/>
           <w:color w:val="333333"/>
-        </w:rPr>
-      </w:pPr>
-      <w:r>
+          <w:szCs w:val="21"/>
+        </w:rPr>
+      </w:pPr>
+      <w:r>
+        <w:rPr>
+          <w:rFonts w:asciiTheme="majorBidi" w:eastAsia="Arial" w:hAnsiTheme="majorBidi" w:cstheme="majorBidi"/>
+          <w:color w:val="333333"/>
+          <w:szCs w:val="21"/>
+        </w:rPr>
+        <w:t xml:space="preserve">Additional supporting packages include </w:t>
+      </w:r>
+      <w:r>
+        <w:rPr>
+          <w:rFonts w:ascii="Consolas" w:eastAsia="Arial" w:hAnsi="Consolas" w:cs="Consolas"/>
+          <w:color w:val="333333"/>
+          <w:szCs w:val="21"/>
+        </w:rPr>
+        <w:t>config</w:t>
+      </w:r>
+      <w:r>
+        <w:rPr>
+          <w:rFonts w:asciiTheme="majorBidi" w:eastAsia="Arial" w:hAnsiTheme="majorBidi" w:cstheme="majorBidi"/>
+          <w:color w:val="333333"/>
+          <w:szCs w:val="21"/>
+        </w:rPr>
+        <w:t xml:space="preserve"> which stores application constants and</w:t>
+      </w:r>
+      <w:r>
+        <w:rPr>
+          <w:rFonts w:ascii="Consolas" w:eastAsia="Arial" w:hAnsi="Consolas" w:cs="Consolas"/>
+          <w:color w:val="333333"/>
+          <w:szCs w:val="21"/>
+        </w:rPr>
+        <w:t xml:space="preserve"> main</w:t>
+      </w:r>
+      <w:r>
+        <w:rPr>
+          <w:rFonts w:asciiTheme="majorBidi" w:eastAsia="Arial" w:hAnsiTheme="majorBidi" w:cstheme="majorBidi"/>
+          <w:color w:val="333333"/>
+          <w:szCs w:val="21"/>
+        </w:rPr>
+        <w:t xml:space="preserve"> which handles application startup.</w:t>
+      </w:r>
+    </w:p>
+    <w:p>
+      <w:pPr>
+        <w:spacing w:before="240"/>
         <w:rPr>
           <w:rFonts w:asciiTheme="majorBidi" w:eastAsia="Arial" w:hAnsiTheme="majorBidi" w:cstheme="majorBidi"/>
           <w:b/>
           <w:bCs/>
-          <w:color w:val="333333"/>
+        </w:rPr>
+      </w:pPr>
+      <w:r>
+        <w:rPr>
+          <w:rFonts w:asciiTheme="majorBidi" w:eastAsia="Arial" w:hAnsiTheme="majorBidi" w:cstheme="majorBidi"/>
+          <w:b/>
+          <w:bCs/>
+        </w:rPr>
+        <w:t>FXML Views</w:t>
+      </w:r>
+    </w:p>
+    <w:p>
+      <w:pPr>
+        <w:spacing w:before="100" w:beforeAutospacing="1" w:after="100" w:afterAutospacing="1" w:line="240" w:lineRule="auto"/>
+        <w:rPr>
+          <w:rFonts w:ascii="Times New Roman" w:eastAsia="Times New Roman" w:hAnsi="Times New Roman" w:cs="Times New Roman"/>
           <w:sz w:val="24"/>
-        </w:rPr>
-        <w:t>FXML Views</w:t>
-      </w:r>
-    </w:p>
-    <w:p>
-      <w:pPr>
-        <w:spacing w:before="200" w:after="80"/>
-        <w:rPr>
-          <w:rFonts w:asciiTheme="majorBidi" w:eastAsia="Arial" w:hAnsiTheme="majorBidi" w:cstheme="majorBidi"/>
-          <w:color w:val="000000" w:themeColor="text1"/>
-        </w:rPr>
-      </w:pPr>
-      <w:r>
-        <w:rPr>
-          <w:rFonts w:asciiTheme="majorBidi" w:eastAsia="Arial" w:hAnsiTheme="majorBidi" w:cstheme="majorBidi"/>
-          <w:color w:val="000000" w:themeColor="text1"/>
-        </w:rPr>
-        <w:t>List all the main FXML files used in the system and explain what screen or functionality it represents.</w:t>
+          <w:szCs w:val="24"/>
+          <w:lang w:eastAsia="en-GB" w:bidi="ar-SA"/>
+        </w:rPr>
+      </w:pPr>
+      <w:r>
+        <w:rPr>
+          <w:rFonts w:ascii="Times New Roman" w:eastAsia="Times New Roman" w:hAnsi="Times New Roman" w:cs="Times New Roman"/>
+          <w:lang w:eastAsia="en-GB" w:bidi="ar-SA"/>
+        </w:rPr>
+        <w:t>FXML files define the layout of the user interface screens, while controllers handle the logic behind them. The main FXML files used in the system include</w:t>
+      </w:r>
+      <w:r>
+        <w:rPr>
+          <w:rFonts w:ascii="Times New Roman" w:eastAsia="Times New Roman" w:hAnsi="Times New Roman" w:cs="Times New Roman"/>
+          <w:sz w:val="24"/>
+          <w:szCs w:val="24"/>
+          <w:lang w:eastAsia="en-GB" w:bidi="ar-SA"/>
+        </w:rPr>
+        <w:t>:</w:t>
+      </w:r>
+    </w:p>
+    <w:p>
+      <w:pPr>
+        <w:numPr>
+          <w:ilvl w:val="0"/>
+          <w:numId w:val="16"/>
+        </w:numPr>
+        <w:spacing w:before="100" w:beforeAutospacing="1" w:after="100" w:afterAutospacing="1" w:line="240" w:lineRule="auto"/>
+        <w:rPr>
+          <w:rFonts w:ascii="Times New Roman" w:eastAsia="Times New Roman" w:hAnsi="Times New Roman" w:cs="Times New Roman"/>
+          <w:lang w:eastAsia="en-GB" w:bidi="ar-SA"/>
+        </w:rPr>
+      </w:pPr>
+      <w:r>
+        <w:rPr>
+          <w:rFonts w:ascii="Consolas" w:eastAsia="Times New Roman" w:hAnsi="Consolas" w:cs="Consolas"/>
+          <w:lang w:eastAsia="en-GB" w:bidi="ar-SA"/>
+        </w:rPr>
+        <w:t>login.fxml</w:t>
+      </w:r>
+      <w:r>
+        <w:rPr>
+          <w:rFonts w:ascii="Times New Roman" w:eastAsia="Times New Roman" w:hAnsi="Times New Roman" w:cs="Times New Roman"/>
+          <w:lang w:eastAsia="en-GB" w:bidi="ar-SA"/>
+        </w:rPr>
+        <w:t xml:space="preserve"> – user login screen </w:t>
+      </w:r>
+    </w:p>
+    <w:p>
+      <w:pPr>
+        <w:numPr>
+          <w:ilvl w:val="0"/>
+          <w:numId w:val="16"/>
+        </w:numPr>
+        <w:spacing w:before="100" w:beforeAutospacing="1" w:after="100" w:afterAutospacing="1" w:line="240" w:lineRule="auto"/>
+        <w:rPr>
+          <w:rFonts w:ascii="Times New Roman" w:eastAsia="Times New Roman" w:hAnsi="Times New Roman" w:cs="Times New Roman"/>
+          <w:lang w:eastAsia="en-GB" w:bidi="ar-SA"/>
+        </w:rPr>
+      </w:pPr>
+      <w:r>
+        <w:rPr>
+          <w:rFonts w:ascii="Consolas" w:eastAsia="Times New Roman" w:hAnsi="Consolas" w:cs="Consolas"/>
+          <w:lang w:eastAsia="en-GB" w:bidi="ar-SA"/>
+        </w:rPr>
+        <w:t>register.fxml</w:t>
+      </w:r>
+      <w:r>
+        <w:rPr>
+          <w:rFonts w:ascii="Times New Roman" w:eastAsia="Times New Roman" w:hAnsi="Times New Roman" w:cs="Times New Roman"/>
+          <w:lang w:eastAsia="en-GB" w:bidi="ar-SA"/>
+        </w:rPr>
+        <w:t xml:space="preserve"> – user registration screen </w:t>
+      </w:r>
+    </w:p>
+    <w:p>
+      <w:pPr>
+        <w:numPr>
+          <w:ilvl w:val="0"/>
+          <w:numId w:val="16"/>
+        </w:numPr>
+        <w:spacing w:before="100" w:beforeAutospacing="1" w:after="100" w:afterAutospacing="1" w:line="240" w:lineRule="auto"/>
+        <w:rPr>
+          <w:rFonts w:ascii="Times New Roman" w:eastAsia="Times New Roman" w:hAnsi="Times New Roman" w:cs="Times New Roman"/>
+          <w:lang w:eastAsia="en-GB" w:bidi="ar-SA"/>
+        </w:rPr>
+      </w:pPr>
+      <w:r>
+        <w:rPr>
+          <w:rFonts w:ascii="Consolas" w:eastAsia="Times New Roman" w:hAnsi="Consolas" w:cs="Consolas"/>
+          <w:lang w:eastAsia="en-GB" w:bidi="ar-SA"/>
+        </w:rPr>
+        <w:t>change-password.fxml</w:t>
+      </w:r>
+      <w:r>
+        <w:rPr>
+          <w:rFonts w:ascii="Times New Roman" w:eastAsia="Times New Roman" w:hAnsi="Times New Roman" w:cs="Times New Roman"/>
+          <w:lang w:eastAsia="en-GB" w:bidi="ar-SA"/>
+        </w:rPr>
+        <w:t xml:space="preserve"> – password update screen </w:t>
+      </w:r>
+    </w:p>
+    <w:p>
+      <w:pPr>
+        <w:numPr>
+          <w:ilvl w:val="0"/>
+          <w:numId w:val="16"/>
+        </w:numPr>
+        <w:spacing w:before="100" w:beforeAutospacing="1" w:after="100" w:afterAutospacing="1" w:line="240" w:lineRule="auto"/>
+        <w:rPr>
+          <w:rFonts w:ascii="Times New Roman" w:eastAsia="Times New Roman" w:hAnsi="Times New Roman" w:cs="Times New Roman"/>
+          <w:lang w:eastAsia="en-GB" w:bidi="ar-SA"/>
+        </w:rPr>
+      </w:pPr>
+      <w:r>
+        <w:rPr>
+          <w:rFonts w:ascii="Consolas" w:eastAsia="Times New Roman" w:hAnsi="Consolas" w:cs="Consolas"/>
+          <w:lang w:eastAsia="en-GB" w:bidi="ar-SA"/>
+        </w:rPr>
+        <w:t>home.fxml</w:t>
+      </w:r>
+      <w:r>
+        <w:rPr>
+          <w:rFonts w:ascii="Times New Roman" w:eastAsia="Times New Roman" w:hAnsi="Times New Roman" w:cs="Times New Roman"/>
+          <w:lang w:eastAsia="en-GB" w:bidi="ar-SA"/>
+        </w:rPr>
+        <w:t xml:space="preserve"> – main dashboard </w:t>
+      </w:r>
+      <w:r>
+        <w:rPr>
+          <w:rFonts w:ascii="Times New Roman" w:eastAsia="Times New Roman" w:hAnsi="Times New Roman" w:cs="Times New Roman"/>
+          <w:lang w:eastAsia="en-GB" w:bidi="ar-SA"/>
+        </w:rPr>
+        <w:t>screen</w:t>
+      </w:r>
+    </w:p>
+    <w:p>
+      <w:pPr>
+        <w:numPr>
+          <w:ilvl w:val="0"/>
+          <w:numId w:val="16"/>
+        </w:numPr>
+        <w:spacing w:before="100" w:beforeAutospacing="1" w:after="100" w:afterAutospacing="1" w:line="240" w:lineRule="auto"/>
+        <w:rPr>
+          <w:rFonts w:ascii="Times New Roman" w:eastAsia="Times New Roman" w:hAnsi="Times New Roman" w:cs="Times New Roman"/>
+          <w:lang w:eastAsia="en-GB" w:bidi="ar-SA"/>
+        </w:rPr>
+      </w:pPr>
+      <w:r>
+        <w:rPr>
+          <w:rFonts w:ascii="Consolas" w:eastAsia="Times New Roman" w:hAnsi="Consolas" w:cs="Consolas"/>
+          <w:lang w:eastAsia="en-GB" w:bidi="ar-SA"/>
+        </w:rPr>
+        <w:t>checkout.fxml</w:t>
+      </w:r>
+      <w:r>
+        <w:rPr>
+          <w:rFonts w:ascii="Times New Roman" w:eastAsia="Times New Roman" w:hAnsi="Times New Roman" w:cs="Times New Roman"/>
+          <w:lang w:eastAsia="en-GB" w:bidi="ar-SA"/>
+        </w:rPr>
+        <w:t xml:space="preserve"> – checkout and payment screen </w:t>
+      </w:r>
+    </w:p>
+    <w:p>
+      <w:pPr>
+        <w:numPr>
+          <w:ilvl w:val="0"/>
+          <w:numId w:val="16"/>
+        </w:numPr>
+        <w:spacing w:before="100" w:beforeAutospacing="1" w:after="100" w:afterAutospacing="1" w:line="240" w:lineRule="auto"/>
+        <w:rPr>
+          <w:rFonts w:ascii="Times New Roman" w:eastAsia="Times New Roman" w:hAnsi="Times New Roman" w:cs="Times New Roman"/>
+          <w:lang w:eastAsia="en-GB" w:bidi="ar-SA"/>
+        </w:rPr>
+      </w:pPr>
+      <w:r>
+        <w:rPr>
+          <w:rFonts w:ascii="Consolas" w:eastAsia="Times New Roman" w:hAnsi="Consolas" w:cs="Consolas"/>
+          <w:lang w:eastAsia="en-GB" w:bidi="ar-SA"/>
+        </w:rPr>
+        <w:t>orders.fxml</w:t>
+      </w:r>
+      <w:r>
+        <w:rPr>
+          <w:rFonts w:ascii="Times New Roman" w:eastAsia="Times New Roman" w:hAnsi="Times New Roman" w:cs="Times New Roman"/>
+          <w:lang w:eastAsia="en-GB" w:bidi="ar-SA"/>
+        </w:rPr>
+        <w:t xml:space="preserve"> – order history screen </w:t>
+      </w:r>
+    </w:p>
+    <w:p>
+      <w:pPr>
+        <w:numPr>
+          <w:ilvl w:val="0"/>
+          <w:numId w:val="16"/>
+        </w:numPr>
+        <w:spacing w:before="100" w:beforeAutospacing="1" w:after="100" w:afterAutospacing="1" w:line="240" w:lineRule="auto"/>
+        <w:rPr>
+          <w:rFonts w:ascii="Times New Roman" w:eastAsia="Times New Roman" w:hAnsi="Times New Roman" w:cs="Times New Roman"/>
+          <w:lang w:eastAsia="en-GB" w:bidi="ar-SA"/>
+        </w:rPr>
+      </w:pPr>
+      <w:r>
+        <w:rPr>
+          <w:rFonts w:ascii="Consolas" w:eastAsia="Times New Roman" w:hAnsi="Consolas" w:cs="Consolas"/>
+          <w:lang w:eastAsia="en-GB" w:bidi="ar-SA"/>
+        </w:rPr>
+        <w:t>promotions.fxml</w:t>
+      </w:r>
+      <w:r>
+        <w:rPr>
+          <w:rFonts w:ascii="Times New Roman" w:eastAsia="Times New Roman" w:hAnsi="Times New Roman" w:cs="Times New Roman"/>
+          <w:lang w:eastAsia="en-GB" w:bidi="ar-SA"/>
+        </w:rPr>
+        <w:t xml:space="preserve"> – promotion management screen </w:t>
+      </w:r>
+    </w:p>
+    <w:p>
+      <w:pPr>
+        <w:numPr>
+          <w:ilvl w:val="0"/>
+          <w:numId w:val="16"/>
+        </w:numPr>
+        <w:spacing w:before="100" w:beforeAutospacing="1" w:after="100" w:afterAutospacing="1" w:line="240" w:lineRule="auto"/>
+        <w:rPr>
+          <w:rFonts w:ascii="Times New Roman" w:eastAsia="Times New Roman" w:hAnsi="Times New Roman" w:cs="Times New Roman"/>
+          <w:lang w:eastAsia="en-GB" w:bidi="ar-SA"/>
+        </w:rPr>
+      </w:pPr>
+      <w:r>
+        <w:rPr>
+          <w:rFonts w:ascii="Consolas" w:eastAsia="Times New Roman" w:hAnsi="Consolas" w:cs="Consolas"/>
+          <w:lang w:eastAsia="en-GB" w:bidi="ar-SA"/>
+        </w:rPr>
+        <w:t>promotion-edit-popup.fxml</w:t>
+      </w:r>
+      <w:r>
+        <w:rPr>
+          <w:rFonts w:ascii="Times New Roman" w:eastAsia="Times New Roman" w:hAnsi="Times New Roman" w:cs="Times New Roman"/>
+          <w:lang w:eastAsia="en-GB" w:bidi="ar-SA"/>
+        </w:rPr>
+        <w:t xml:space="preserve"> – promotion editing popup </w:t>
+      </w:r>
+    </w:p>
+    <w:p>
+      <w:pPr>
+        <w:numPr>
+          <w:ilvl w:val="0"/>
+          <w:numId w:val="16"/>
+        </w:numPr>
+        <w:spacing w:before="100" w:beforeAutospacing="1" w:after="100" w:afterAutospacing="1" w:line="240" w:lineRule="auto"/>
+        <w:rPr>
+          <w:rFonts w:ascii="Times New Roman" w:eastAsia="Times New Roman" w:hAnsi="Times New Roman" w:cs="Times New Roman"/>
+          <w:lang w:eastAsia="en-GB" w:bidi="ar-SA"/>
+        </w:rPr>
+      </w:pPr>
+      <w:r>
+        <w:rPr>
+          <w:rFonts w:ascii="Consolas" w:eastAsia="Times New Roman" w:hAnsi="Consolas" w:cs="Consolas"/>
+          <w:lang w:eastAsia="en-GB" w:bidi="ar-SA"/>
+        </w:rPr>
+        <w:t>reports.fxml</w:t>
+      </w:r>
+      <w:r>
+        <w:rPr>
+          <w:rFonts w:ascii="Times New Roman" w:eastAsia="Times New Roman" w:hAnsi="Times New Roman" w:cs="Times New Roman"/>
+          <w:lang w:eastAsia="en-GB" w:bidi="ar-SA"/>
+        </w:rPr>
+        <w:t xml:space="preserve"> – report display screen </w:t>
+      </w:r>
+    </w:p>
+    <w:p>
+      <w:pPr>
+        <w:rPr>
+          <w:rFonts w:asciiTheme="majorBidi" w:eastAsia="Times New Roman" w:hAnsiTheme="majorBidi" w:cstheme="majorBidi"/>
+          <w:b/>
+          <w:bCs/>
+          <w:lang w:eastAsia="en-GB" w:bidi="ar-SA"/>
+        </w:rPr>
+      </w:pPr>
+      <w:r>
+        <w:rPr>
+          <w:rFonts w:asciiTheme="majorBidi" w:eastAsia="Times New Roman" w:hAnsiTheme="majorBidi" w:cstheme="majorBidi"/>
+          <w:lang w:eastAsia="en-GB" w:bidi="ar-SA"/>
+        </w:rPr>
+        <w:t>The system uses JavaFX controls such as buttons, text fields, and table views to handle user input and display data. Data is stored in SQLite database tables including users, orders, promotions, and payment related data.</w:t>
       </w:r>
     </w:p>
     <w:p>
@@ -4548,11 +4473,12 @@
           <w:rFonts w:asciiTheme="majorBidi" w:hAnsiTheme="majorBidi"/>
         </w:rPr>
       </w:pPr>
-      <w:bookmarkStart w:id="9" w:name="_Toc226910857"/>
+      <w:bookmarkStart w:id="8" w:name="_Toc227940241"/>
       <w:r>
         <w:rPr>
           <w:rFonts w:asciiTheme="majorBidi" w:hAnsiTheme="majorBidi"/>
         </w:rPr>
+        <w:lastRenderedPageBreak/>
         <w:t>3</w:t>
       </w:r>
       <w:r>
@@ -4562,53 +4488,53 @@
         <w:tab/>
         <w:t>Run-Time Components and Deployment</w:t>
       </w:r>
+      <w:bookmarkEnd w:id="8"/>
+    </w:p>
+    <w:p>
+      <w:pPr>
+        <w:pStyle w:val="Heading2"/>
+        <w:rPr>
+          <w:rFonts w:asciiTheme="majorBidi" w:hAnsiTheme="majorBidi"/>
+        </w:rPr>
+      </w:pPr>
+      <w:bookmarkStart w:id="9" w:name="_Toc227940242"/>
+      <w:r>
+        <w:rPr>
+          <w:rFonts w:asciiTheme="majorBidi" w:hAnsiTheme="majorBidi"/>
+        </w:rPr>
+        <w:t>3.1   Run-Time Components</w:t>
+      </w:r>
       <w:bookmarkEnd w:id="9"/>
     </w:p>
     <w:p>
       <w:pPr>
+        <w:pStyle w:val="Textbody"/>
+        <w:rPr>
+          <w:rFonts w:asciiTheme="majorBidi" w:hAnsiTheme="majorBidi" w:cstheme="majorBidi"/>
+        </w:rPr>
+      </w:pPr>
+      <w:r>
+        <w:rPr>
+          <w:rFonts w:asciiTheme="majorBidi" w:hAnsiTheme="majorBidi" w:cstheme="majorBidi"/>
+        </w:rPr>
+        <w:t>List the main components needed to run the system and then explain what each component is used for.</w:t>
+      </w:r>
+    </w:p>
+    <w:p>
+      <w:pPr>
         <w:pStyle w:val="Heading2"/>
         <w:rPr>
           <w:rFonts w:asciiTheme="majorBidi" w:hAnsiTheme="majorBidi"/>
         </w:rPr>
       </w:pPr>
-      <w:bookmarkStart w:id="10" w:name="_Toc226910858"/>
+      <w:bookmarkStart w:id="10" w:name="_Toc227940243"/>
       <w:r>
         <w:rPr>
           <w:rFonts w:asciiTheme="majorBidi" w:hAnsiTheme="majorBidi"/>
         </w:rPr>
-        <w:t>3.1   Run-Time Components</w:t>
+        <w:t>3.2   Deployment</w:t>
       </w:r>
       <w:bookmarkEnd w:id="10"/>
-    </w:p>
-    <w:p>
-      <w:pPr>
-        <w:pStyle w:val="Textbody"/>
-        <w:rPr>
-          <w:rFonts w:asciiTheme="majorBidi" w:hAnsiTheme="majorBidi" w:cstheme="majorBidi"/>
-        </w:rPr>
-      </w:pPr>
-      <w:r>
-        <w:rPr>
-          <w:rFonts w:asciiTheme="majorBidi" w:hAnsiTheme="majorBidi" w:cstheme="majorBidi"/>
-        </w:rPr>
-        <w:t>List the main components needed to run the system and then explain what each component is used for.</w:t>
-      </w:r>
-    </w:p>
-    <w:p>
-      <w:pPr>
-        <w:pStyle w:val="Heading2"/>
-        <w:rPr>
-          <w:rFonts w:asciiTheme="majorBidi" w:hAnsiTheme="majorBidi"/>
-        </w:rPr>
-      </w:pPr>
-      <w:bookmarkStart w:id="11" w:name="_Toc226910859"/>
-      <w:r>
-        <w:rPr>
-          <w:rFonts w:asciiTheme="majorBidi" w:hAnsiTheme="majorBidi"/>
-        </w:rPr>
-        <w:t>3.2   Deployment</w:t>
-      </w:r>
-      <w:bookmarkEnd w:id="11"/>
       <w:r>
         <w:rPr>
           <w:rFonts w:asciiTheme="majorBidi" w:hAnsiTheme="majorBidi"/>
@@ -4644,7 +4570,7 @@
           <w:rFonts w:asciiTheme="majorBidi" w:hAnsiTheme="majorBidi"/>
         </w:rPr>
       </w:pPr>
-      <w:bookmarkStart w:id="12" w:name="_Toc226910860"/>
+      <w:bookmarkStart w:id="11" w:name="_Toc227940244"/>
       <w:r>
         <w:rPr>
           <w:rFonts w:asciiTheme="majorBidi" w:hAnsiTheme="majorBidi"/>
@@ -4658,23 +4584,23 @@
         <w:tab/>
         <w:t>Testing Plan and Results</w:t>
       </w:r>
+      <w:bookmarkEnd w:id="11"/>
+    </w:p>
+    <w:p>
+      <w:pPr>
+        <w:pStyle w:val="Heading2"/>
+        <w:rPr>
+          <w:rFonts w:asciiTheme="majorBidi" w:hAnsiTheme="majorBidi"/>
+        </w:rPr>
+      </w:pPr>
+      <w:bookmarkStart w:id="12" w:name="_Toc227940245"/>
+      <w:r>
+        <w:rPr>
+          <w:rFonts w:asciiTheme="majorBidi" w:hAnsiTheme="majorBidi"/>
+        </w:rPr>
+        <w:t>4.1   Unit Testing</w:t>
+      </w:r>
       <w:bookmarkEnd w:id="12"/>
-    </w:p>
-    <w:p>
-      <w:pPr>
-        <w:pStyle w:val="Heading2"/>
-        <w:rPr>
-          <w:rFonts w:asciiTheme="majorBidi" w:hAnsiTheme="majorBidi"/>
-        </w:rPr>
-      </w:pPr>
-      <w:bookmarkStart w:id="13" w:name="_Toc226910861"/>
-      <w:r>
-        <w:rPr>
-          <w:rFonts w:asciiTheme="majorBidi" w:hAnsiTheme="majorBidi"/>
-        </w:rPr>
-        <w:t>4.1   Unit Testing</w:t>
-      </w:r>
-      <w:bookmarkEnd w:id="13"/>
     </w:p>
     <w:p>
       <w:pPr>
@@ -4721,14 +4647,14 @@
           <w:rFonts w:asciiTheme="majorBidi" w:hAnsiTheme="majorBidi"/>
         </w:rPr>
       </w:pPr>
-      <w:bookmarkStart w:id="14" w:name="_Toc226910862"/>
+      <w:bookmarkStart w:id="13" w:name="_Toc227940246"/>
       <w:r>
         <w:rPr>
           <w:rFonts w:asciiTheme="majorBidi" w:hAnsiTheme="majorBidi"/>
         </w:rPr>
         <w:t>4.2   Subsystem Testing</w:t>
       </w:r>
-      <w:bookmarkEnd w:id="14"/>
+      <w:bookmarkEnd w:id="13"/>
     </w:p>
     <w:p>
       <w:pPr>
@@ -4773,14 +4699,14 @@
           <w:rFonts w:asciiTheme="majorBidi" w:hAnsiTheme="majorBidi"/>
         </w:rPr>
       </w:pPr>
-      <w:bookmarkStart w:id="15" w:name="_Toc226910863"/>
+      <w:bookmarkStart w:id="14" w:name="_Toc227940247"/>
       <w:r>
         <w:rPr>
           <w:rFonts w:asciiTheme="majorBidi" w:hAnsiTheme="majorBidi"/>
         </w:rPr>
         <w:t>4.3   Required Interface Testing</w:t>
       </w:r>
-      <w:bookmarkEnd w:id="15"/>
+      <w:bookmarkEnd w:id="14"/>
     </w:p>
     <w:p>
       <w:pPr>
@@ -4839,14 +4765,14 @@
           <w:rFonts w:asciiTheme="majorBidi" w:hAnsiTheme="majorBidi"/>
         </w:rPr>
       </w:pPr>
-      <w:bookmarkStart w:id="16" w:name="_Toc226910864"/>
+      <w:bookmarkStart w:id="15" w:name="_Toc227940248"/>
       <w:r>
         <w:rPr>
           <w:rFonts w:asciiTheme="majorBidi" w:hAnsiTheme="majorBidi"/>
         </w:rPr>
         <w:t>4.4   Non-Functional Testing</w:t>
       </w:r>
-      <w:bookmarkEnd w:id="16"/>
+      <w:bookmarkEnd w:id="15"/>
     </w:p>
     <w:p>
       <w:pPr>
@@ -4877,12 +4803,11 @@
           <w:rFonts w:asciiTheme="majorBidi" w:hAnsiTheme="majorBidi"/>
         </w:rPr>
       </w:pPr>
-      <w:bookmarkStart w:id="17" w:name="_Toc226910865"/>
+      <w:bookmarkStart w:id="16" w:name="_Toc227940249"/>
       <w:r>
         <w:rPr>
           <w:rFonts w:asciiTheme="majorBidi" w:hAnsiTheme="majorBidi"/>
         </w:rPr>
-        <w:lastRenderedPageBreak/>
         <w:t>5</w:t>
       </w:r>
       <w:r>
@@ -4892,37 +4817,37 @@
         <w:tab/>
         <w:t>Conclusion</w:t>
       </w:r>
+      <w:bookmarkEnd w:id="16"/>
+    </w:p>
+    <w:p>
+      <w:pPr>
+        <w:pStyle w:val="Textbody"/>
+        <w:rPr>
+          <w:rFonts w:asciiTheme="majorBidi" w:hAnsiTheme="majorBidi" w:cstheme="majorBidi"/>
+        </w:rPr>
+      </w:pPr>
+      <w:r>
+        <w:rPr>
+          <w:rFonts w:asciiTheme="majorBidi" w:hAnsiTheme="majorBidi" w:cstheme="majorBidi"/>
+        </w:rPr>
+        <w:t>Summarise what the system achieves.</w:t>
+      </w:r>
+    </w:p>
+    <w:p>
+      <w:pPr>
+        <w:pStyle w:val="Heading1"/>
+        <w:rPr>
+          <w:rFonts w:asciiTheme="majorBidi" w:hAnsiTheme="majorBidi"/>
+        </w:rPr>
+      </w:pPr>
+      <w:bookmarkStart w:id="17" w:name="_Toc227940250"/>
+      <w:r>
+        <w:rPr>
+          <w:rFonts w:asciiTheme="majorBidi" w:hAnsiTheme="majorBidi"/>
+        </w:rPr>
+        <w:t>Appendix:</w:t>
+      </w:r>
       <w:bookmarkEnd w:id="17"/>
-    </w:p>
-    <w:p>
-      <w:pPr>
-        <w:pStyle w:val="Textbody"/>
-        <w:rPr>
-          <w:rFonts w:asciiTheme="majorBidi" w:hAnsiTheme="majorBidi" w:cstheme="majorBidi"/>
-        </w:rPr>
-      </w:pPr>
-      <w:r>
-        <w:rPr>
-          <w:rFonts w:asciiTheme="majorBidi" w:hAnsiTheme="majorBidi" w:cstheme="majorBidi"/>
-        </w:rPr>
-        <w:t>Summarise what the system achieves.</w:t>
-      </w:r>
-    </w:p>
-    <w:p>
-      <w:pPr>
-        <w:pStyle w:val="Heading1"/>
-        <w:rPr>
-          <w:rFonts w:asciiTheme="majorBidi" w:hAnsiTheme="majorBidi"/>
-        </w:rPr>
-      </w:pPr>
-      <w:bookmarkStart w:id="18" w:name="_Toc226910866"/>
-      <w:r>
-        <w:rPr>
-          <w:rFonts w:asciiTheme="majorBidi" w:hAnsiTheme="majorBidi"/>
-        </w:rPr>
-        <w:t>Appendix:</w:t>
-      </w:r>
-      <w:bookmarkEnd w:id="18"/>
     </w:p>
     <w:p>
       <w:pPr>
@@ -6101,6 +6026,155 @@
     </w:lvl>
   </w:abstractNum>
   <w:abstractNum w:abstractNumId="9" w15:restartNumberingAfterBreak="0">
+    <w:nsid w:val="33E51CE8"/>
+    <w:multiLevelType w:val="multilevel"/>
+    <w:tmpl w:val="6B3C7BF2"/>
+    <w:lvl w:ilvl="0">
+      <w:start w:val="1"/>
+      <w:numFmt w:val="bullet"/>
+      <w:lvlText w:val=""/>
+      <w:lvlJc w:val="left"/>
+      <w:pPr>
+        <w:tabs>
+          <w:tab w:val="num" w:pos="720"/>
+        </w:tabs>
+        <w:ind w:left="720" w:hanging="360"/>
+      </w:pPr>
+      <w:rPr>
+        <w:rFonts w:ascii="Symbol" w:hAnsi="Symbol" w:hint="default"/>
+        <w:sz w:val="20"/>
+      </w:rPr>
+    </w:lvl>
+    <w:lvl w:ilvl="1" w:tentative="1">
+      <w:start w:val="1"/>
+      <w:numFmt w:val="bullet"/>
+      <w:lvlText w:val="o"/>
+      <w:lvlJc w:val="left"/>
+      <w:pPr>
+        <w:tabs>
+          <w:tab w:val="num" w:pos="1440"/>
+        </w:tabs>
+        <w:ind w:left="1440" w:hanging="360"/>
+      </w:pPr>
+      <w:rPr>
+        <w:rFonts w:ascii="Courier New" w:hAnsi="Courier New" w:hint="default"/>
+        <w:sz w:val="20"/>
+      </w:rPr>
+    </w:lvl>
+    <w:lvl w:ilvl="2" w:tentative="1">
+      <w:start w:val="1"/>
+      <w:numFmt w:val="bullet"/>
+      <w:lvlText w:val=""/>
+      <w:lvlJc w:val="left"/>
+      <w:pPr>
+        <w:tabs>
+          <w:tab w:val="num" w:pos="2160"/>
+        </w:tabs>
+        <w:ind w:left="2160" w:hanging="360"/>
+      </w:pPr>
+      <w:rPr>
+        <w:rFonts w:ascii="Wingdings" w:hAnsi="Wingdings" w:hint="default"/>
+        <w:sz w:val="20"/>
+      </w:rPr>
+    </w:lvl>
+    <w:lvl w:ilvl="3" w:tentative="1">
+      <w:start w:val="1"/>
+      <w:numFmt w:val="bullet"/>
+      <w:lvlText w:val=""/>
+      <w:lvlJc w:val="left"/>
+      <w:pPr>
+        <w:tabs>
+          <w:tab w:val="num" w:pos="2880"/>
+        </w:tabs>
+        <w:ind w:left="2880" w:hanging="360"/>
+      </w:pPr>
+      <w:rPr>
+        <w:rFonts w:ascii="Wingdings" w:hAnsi="Wingdings" w:hint="default"/>
+        <w:sz w:val="20"/>
+      </w:rPr>
+    </w:lvl>
+    <w:lvl w:ilvl="4" w:tentative="1">
+      <w:start w:val="1"/>
+      <w:numFmt w:val="bullet"/>
+      <w:lvlText w:val=""/>
+      <w:lvlJc w:val="left"/>
+      <w:pPr>
+        <w:tabs>
+          <w:tab w:val="num" w:pos="3600"/>
+        </w:tabs>
+        <w:ind w:left="3600" w:hanging="360"/>
+      </w:pPr>
+      <w:rPr>
+        <w:rFonts w:ascii="Wingdings" w:hAnsi="Wingdings" w:hint="default"/>
+        <w:sz w:val="20"/>
+      </w:rPr>
+    </w:lvl>
+    <w:lvl w:ilvl="5" w:tentative="1">
+      <w:start w:val="1"/>
+      <w:numFmt w:val="bullet"/>
+      <w:lvlText w:val=""/>
+      <w:lvlJc w:val="left"/>
+      <w:pPr>
+        <w:tabs>
+          <w:tab w:val="num" w:pos="4320"/>
+        </w:tabs>
+        <w:ind w:left="4320" w:hanging="360"/>
+      </w:pPr>
+      <w:rPr>
+        <w:rFonts w:ascii="Wingdings" w:hAnsi="Wingdings" w:hint="default"/>
+        <w:sz w:val="20"/>
+      </w:rPr>
+    </w:lvl>
+    <w:lvl w:ilvl="6" w:tentative="1">
+      <w:start w:val="1"/>
+      <w:numFmt w:val="bullet"/>
+      <w:lvlText w:val=""/>
+      <w:lvlJc w:val="left"/>
+      <w:pPr>
+        <w:tabs>
+          <w:tab w:val="num" w:pos="5040"/>
+        </w:tabs>
+        <w:ind w:left="5040" w:hanging="360"/>
+      </w:pPr>
+      <w:rPr>
+        <w:rFonts w:ascii="Wingdings" w:hAnsi="Wingdings" w:hint="default"/>
+        <w:sz w:val="20"/>
+      </w:rPr>
+    </w:lvl>
+    <w:lvl w:ilvl="7" w:tentative="1">
+      <w:start w:val="1"/>
+      <w:numFmt w:val="bullet"/>
+      <w:lvlText w:val=""/>
+      <w:lvlJc w:val="left"/>
+      <w:pPr>
+        <w:tabs>
+          <w:tab w:val="num" w:pos="5760"/>
+        </w:tabs>
+        <w:ind w:left="5760" w:hanging="360"/>
+      </w:pPr>
+      <w:rPr>
+        <w:rFonts w:ascii="Wingdings" w:hAnsi="Wingdings" w:hint="default"/>
+        <w:sz w:val="20"/>
+      </w:rPr>
+    </w:lvl>
+    <w:lvl w:ilvl="8" w:tentative="1">
+      <w:start w:val="1"/>
+      <w:numFmt w:val="bullet"/>
+      <w:lvlText w:val=""/>
+      <w:lvlJc w:val="left"/>
+      <w:pPr>
+        <w:tabs>
+          <w:tab w:val="num" w:pos="6480"/>
+        </w:tabs>
+        <w:ind w:left="6480" w:hanging="360"/>
+      </w:pPr>
+      <w:rPr>
+        <w:rFonts w:ascii="Wingdings" w:hAnsi="Wingdings" w:hint="default"/>
+        <w:sz w:val="20"/>
+      </w:rPr>
+    </w:lvl>
+  </w:abstractNum>
+  <w:abstractNum w:abstractNumId="10" w15:restartNumberingAfterBreak="0">
     <w:nsid w:val="34D34254"/>
     <w:multiLevelType w:val="multilevel"/>
     <w:tmpl w:val="AC6ACF16"/>
@@ -6249,7 +6323,7 @@
       </w:rPr>
     </w:lvl>
   </w:abstractNum>
-  <w:abstractNum w:abstractNumId="10" w15:restartNumberingAfterBreak="0">
+  <w:abstractNum w:abstractNumId="11" w15:restartNumberingAfterBreak="0">
     <w:nsid w:val="3DDA0F9E"/>
     <w:multiLevelType w:val="multilevel"/>
     <w:tmpl w:val="B846F0B6"/>
@@ -6398,7 +6472,7 @@
       </w:rPr>
     </w:lvl>
   </w:abstractNum>
-  <w:abstractNum w:abstractNumId="11" w15:restartNumberingAfterBreak="0">
+  <w:abstractNum w:abstractNumId="12" w15:restartNumberingAfterBreak="0">
     <w:nsid w:val="444D76ED"/>
     <w:multiLevelType w:val="hybridMultilevel"/>
     <w:tmpl w:val="586810BA"/>
@@ -6511,7 +6585,7 @@
       </w:rPr>
     </w:lvl>
   </w:abstractNum>
-  <w:abstractNum w:abstractNumId="12" w15:restartNumberingAfterBreak="0">
+  <w:abstractNum w:abstractNumId="13" w15:restartNumberingAfterBreak="0">
     <w:nsid w:val="5CCC41CB"/>
     <w:multiLevelType w:val="multilevel"/>
     <w:tmpl w:val="8A6A8BA6"/>
@@ -6660,7 +6734,7 @@
       </w:rPr>
     </w:lvl>
   </w:abstractNum>
-  <w:abstractNum w:abstractNumId="13" w15:restartNumberingAfterBreak="0">
+  <w:abstractNum w:abstractNumId="14" w15:restartNumberingAfterBreak="0">
     <w:nsid w:val="63AF722E"/>
     <w:multiLevelType w:val="multilevel"/>
     <w:tmpl w:val="50D095C4"/>
@@ -6773,7 +6847,7 @@
       </w:pPr>
     </w:lvl>
   </w:abstractNum>
-  <w:abstractNum w:abstractNumId="14" w15:restartNumberingAfterBreak="0">
+  <w:abstractNum w:abstractNumId="15" w15:restartNumberingAfterBreak="0">
     <w:nsid w:val="666278C7"/>
     <w:multiLevelType w:val="multilevel"/>
     <w:tmpl w:val="5B3ED9AA"/>
@@ -6935,10 +7009,10 @@
     <w:abstractNumId w:val="2"/>
   </w:num>
   <w:num w:numId="5" w16cid:durableId="154995654">
-    <w:abstractNumId w:val="10"/>
+    <w:abstractNumId w:val="11"/>
   </w:num>
   <w:num w:numId="6" w16cid:durableId="1721051065">
-    <w:abstractNumId w:val="12"/>
+    <w:abstractNumId w:val="13"/>
   </w:num>
   <w:num w:numId="7" w16cid:durableId="728504474">
     <w:abstractNumId w:val="4"/>
@@ -6950,21 +7024,24 @@
     <w:abstractNumId w:val="0"/>
   </w:num>
   <w:num w:numId="10" w16cid:durableId="1617636763">
-    <w:abstractNumId w:val="11"/>
+    <w:abstractNumId w:val="12"/>
   </w:num>
   <w:num w:numId="11" w16cid:durableId="2089228491">
     <w:abstractNumId w:val="8"/>
   </w:num>
   <w:num w:numId="12" w16cid:durableId="2101247667">
-    <w:abstractNumId w:val="13"/>
+    <w:abstractNumId w:val="14"/>
   </w:num>
   <w:num w:numId="13" w16cid:durableId="2134202955">
-    <w:abstractNumId w:val="14"/>
+    <w:abstractNumId w:val="15"/>
   </w:num>
   <w:num w:numId="14" w16cid:durableId="552497901">
     <w:abstractNumId w:val="3"/>
   </w:num>
   <w:num w:numId="15" w16cid:durableId="2135249883">
+    <w:abstractNumId w:val="10"/>
+  </w:num>
+  <w:num w:numId="16" w16cid:durableId="730465215">
     <w:abstractNumId w:val="9"/>
   </w:num>
 </w:numbering>
@@ -7423,7 +7500,6 @@
     <w:next w:val="Normal"/>
     <w:link w:val="Heading3Char"/>
     <w:uiPriority w:val="9"/>
-    <w:semiHidden/>
     <w:unhideWhenUsed/>
     <w:qFormat/>
     <w:rsid w:val="00515FDB"/>
@@ -7641,7 +7717,6 @@
     <w:basedOn w:val="DefaultParagraphFont"/>
     <w:link w:val="Heading3"/>
     <w:uiPriority w:val="9"/>
-    <w:semiHidden/>
     <w:rsid w:val="00515FDB"/>
     <w:rPr>
       <w:rFonts w:asciiTheme="majorHAnsi" w:eastAsiaTheme="majorEastAsia" w:hAnsiTheme="majorHAnsi" w:cstheme="majorBidi"/>
@@ -8145,6 +8220,23 @@
       <w:szCs w:val="20"/>
     </w:rPr>
   </w:style>
+  <w:style w:type="paragraph" w:styleId="TOC3">
+    <w:name w:val="toc 3"/>
+    <w:basedOn w:val="Normal"/>
+    <w:next w:val="Normal"/>
+    <w:autoRedefine/>
+    <w:uiPriority w:val="39"/>
+    <w:unhideWhenUsed/>
+    <w:rsid w:val="00293B2B"/>
+    <w:pPr>
+      <w:spacing w:after="100"/>
+      <w:ind w:left="440"/>
+    </w:pPr>
+    <w:rPr>
+      <w:rFonts w:cs="Mangal"/>
+      <w:szCs w:val="20"/>
+    </w:rPr>
+  </w:style>
 </w:styles>
 </file>
 

</xml_diff>